<commit_message>
added Benny's section to AI doc
</commit_message>
<xml_diff>
--- a/AI_evaluation.docx
+++ b/AI_evaluation.docx
@@ -247,8 +247,16 @@
               <w:rPr>
                 <w:color w:val="2F5496" w:themeColor="accent1" w:themeShade="BF"/>
               </w:rPr>
-              <w:t>Fill in full name here…</w:t>
-            </w:r>
+              <w:t xml:space="preserve">Benny </w:t>
+            </w:r>
+            <w:proofErr w:type="spellStart"/>
+            <w:r>
+              <w:rPr>
+                <w:color w:val="2F5496" w:themeColor="accent1" w:themeShade="BF"/>
+              </w:rPr>
+              <w:t>EIsner</w:t>
+            </w:r>
+            <w:proofErr w:type="spellEnd"/>
           </w:p>
         </w:tc>
         <w:tc>
@@ -257,14 +265,8 @@
             <w:vAlign w:val="center"/>
           </w:tcPr>
           <w:p>
-            <w:pPr>
-              <w:jc w:val="center"/>
-            </w:pPr>
-            <w:r>
-              <w:rPr>
-                <w:color w:val="2F5496" w:themeColor="accent1" w:themeShade="BF"/>
-              </w:rPr>
-              <w:t>…</w:t>
+            <w:r>
+              <w:t>8</w:t>
             </w:r>
           </w:p>
         </w:tc>
@@ -274,13 +276,10 @@
           </w:tcPr>
           <w:p>
             <w:r>
-              <w:t xml:space="preserve">- </w:t>
-            </w:r>
-            <w:r>
-              <w:rPr>
-                <w:color w:val="2F5496" w:themeColor="accent1" w:themeShade="BF"/>
-              </w:rPr>
-              <w:t>…</w:t>
+              <w:t>-</w:t>
+            </w:r>
+            <w:r>
+              <w:t xml:space="preserve"> Part 4, general code review</w:t>
             </w:r>
           </w:p>
           <w:p>
@@ -680,15 +679,15 @@
         <w:tblLook w:val="04A0" w:firstRow="1" w:lastRow="0" w:firstColumn="1" w:lastColumn="0" w:noHBand="0" w:noVBand="1"/>
       </w:tblPr>
       <w:tblGrid>
-        <w:gridCol w:w="490"/>
-        <w:gridCol w:w="546"/>
-        <w:gridCol w:w="237"/>
-        <w:gridCol w:w="1099"/>
-        <w:gridCol w:w="994"/>
-        <w:gridCol w:w="315"/>
-        <w:gridCol w:w="2481"/>
-        <w:gridCol w:w="2197"/>
-        <w:gridCol w:w="239"/>
+        <w:gridCol w:w="491"/>
+        <w:gridCol w:w="540"/>
+        <w:gridCol w:w="243"/>
+        <w:gridCol w:w="1305"/>
+        <w:gridCol w:w="788"/>
+        <w:gridCol w:w="332"/>
+        <w:gridCol w:w="2577"/>
+        <w:gridCol w:w="2045"/>
+        <w:gridCol w:w="277"/>
         <w:gridCol w:w="821"/>
         <w:gridCol w:w="1037"/>
       </w:tblGrid>
@@ -698,7 +697,7 @@
         </w:trPr>
         <w:tc>
           <w:tcPr>
-            <w:tcW w:w="503" w:type="dxa"/>
+            <w:tcW w:w="490" w:type="dxa"/>
             <w:shd w:val="clear" w:color="auto" w:fill="D9E2F3" w:themeFill="accent1" w:themeFillTint="33"/>
           </w:tcPr>
           <w:p>
@@ -719,7 +718,7 @@
         </w:tc>
         <w:tc>
           <w:tcPr>
-            <w:tcW w:w="726" w:type="dxa"/>
+            <w:tcW w:w="784" w:type="dxa"/>
             <w:gridSpan w:val="2"/>
             <w:shd w:val="clear" w:color="auto" w:fill="FFF2CC" w:themeFill="accent4" w:themeFillTint="33"/>
           </w:tcPr>
@@ -741,7 +740,7 @@
         </w:tc>
         <w:tc>
           <w:tcPr>
-            <w:tcW w:w="2096" w:type="dxa"/>
+            <w:tcW w:w="2093" w:type="dxa"/>
             <w:gridSpan w:val="2"/>
             <w:shd w:val="clear" w:color="auto" w:fill="FFF2CC" w:themeFill="accent4" w:themeFillTint="33"/>
           </w:tcPr>
@@ -777,7 +776,7 @@
         </w:tc>
         <w:tc>
           <w:tcPr>
-            <w:tcW w:w="5209" w:type="dxa"/>
+            <w:tcW w:w="5231" w:type="dxa"/>
             <w:gridSpan w:val="4"/>
             <w:shd w:val="clear" w:color="auto" w:fill="FFF2CC" w:themeFill="accent4" w:themeFillTint="33"/>
           </w:tcPr>
@@ -799,7 +798,7 @@
         </w:tc>
         <w:tc>
           <w:tcPr>
-            <w:tcW w:w="848" w:type="dxa"/>
+            <w:tcW w:w="821" w:type="dxa"/>
             <w:shd w:val="clear" w:color="auto" w:fill="FFF2CC" w:themeFill="accent4" w:themeFillTint="33"/>
           </w:tcPr>
           <w:p>
@@ -833,7 +832,7 @@
         </w:tc>
         <w:tc>
           <w:tcPr>
-            <w:tcW w:w="1074" w:type="dxa"/>
+            <w:tcW w:w="1037" w:type="dxa"/>
             <w:shd w:val="clear" w:color="auto" w:fill="FFF2CC" w:themeFill="accent4" w:themeFillTint="33"/>
           </w:tcPr>
           <w:p>
@@ -864,7 +863,7 @@
         </w:trPr>
         <w:tc>
           <w:tcPr>
-            <w:tcW w:w="503" w:type="dxa"/>
+            <w:tcW w:w="490" w:type="dxa"/>
             <w:shd w:val="clear" w:color="auto" w:fill="E2EFD9" w:themeFill="accent6" w:themeFillTint="33"/>
             <w:vAlign w:val="center"/>
           </w:tcPr>
@@ -885,7 +884,7 @@
         </w:tc>
         <w:tc>
           <w:tcPr>
-            <w:tcW w:w="726" w:type="dxa"/>
+            <w:tcW w:w="784" w:type="dxa"/>
             <w:gridSpan w:val="2"/>
             <w:vAlign w:val="center"/>
           </w:tcPr>
@@ -897,7 +896,7 @@
         </w:tc>
         <w:tc>
           <w:tcPr>
-            <w:tcW w:w="2096" w:type="dxa"/>
+            <w:tcW w:w="2093" w:type="dxa"/>
             <w:gridSpan w:val="2"/>
           </w:tcPr>
           <w:p>
@@ -952,7 +951,7 @@
         </w:tc>
         <w:tc>
           <w:tcPr>
-            <w:tcW w:w="5209" w:type="dxa"/>
+            <w:tcW w:w="5231" w:type="dxa"/>
             <w:gridSpan w:val="4"/>
           </w:tcPr>
           <w:p>
@@ -966,7 +965,7 @@
         </w:tc>
         <w:tc>
           <w:tcPr>
-            <w:tcW w:w="848" w:type="dxa"/>
+            <w:tcW w:w="821" w:type="dxa"/>
           </w:tcPr>
           <w:p>
             <w:r>
@@ -976,7 +975,7 @@
         </w:tc>
         <w:tc>
           <w:tcPr>
-            <w:tcW w:w="1074" w:type="dxa"/>
+            <w:tcW w:w="1037" w:type="dxa"/>
           </w:tcPr>
           <w:p>
             <w:r>
@@ -991,7 +990,7 @@
         </w:trPr>
         <w:tc>
           <w:tcPr>
-            <w:tcW w:w="503" w:type="dxa"/>
+            <w:tcW w:w="490" w:type="dxa"/>
             <w:shd w:val="clear" w:color="auto" w:fill="E2EFD9" w:themeFill="accent6" w:themeFillTint="33"/>
             <w:vAlign w:val="center"/>
           </w:tcPr>
@@ -1006,7 +1005,7 @@
         </w:tc>
         <w:tc>
           <w:tcPr>
-            <w:tcW w:w="726" w:type="dxa"/>
+            <w:tcW w:w="784" w:type="dxa"/>
             <w:gridSpan w:val="2"/>
             <w:vAlign w:val="center"/>
           </w:tcPr>
@@ -1021,7 +1020,7 @@
         </w:tc>
         <w:tc>
           <w:tcPr>
-            <w:tcW w:w="2096" w:type="dxa"/>
+            <w:tcW w:w="2093" w:type="dxa"/>
             <w:gridSpan w:val="2"/>
           </w:tcPr>
           <w:p>
@@ -1077,7 +1076,7 @@
         </w:tc>
         <w:tc>
           <w:tcPr>
-            <w:tcW w:w="5209" w:type="dxa"/>
+            <w:tcW w:w="5231" w:type="dxa"/>
             <w:gridSpan w:val="4"/>
           </w:tcPr>
           <w:p>
@@ -1189,7 +1188,7 @@
         </w:tc>
         <w:tc>
           <w:tcPr>
-            <w:tcW w:w="848" w:type="dxa"/>
+            <w:tcW w:w="821" w:type="dxa"/>
           </w:tcPr>
           <w:p>
             <w:r>
@@ -1199,7 +1198,7 @@
         </w:tc>
         <w:tc>
           <w:tcPr>
-            <w:tcW w:w="1074" w:type="dxa"/>
+            <w:tcW w:w="1037" w:type="dxa"/>
           </w:tcPr>
           <w:p>
             <w:r>
@@ -1214,7 +1213,7 @@
         </w:trPr>
         <w:tc>
           <w:tcPr>
-            <w:tcW w:w="503" w:type="dxa"/>
+            <w:tcW w:w="490" w:type="dxa"/>
             <w:shd w:val="clear" w:color="auto" w:fill="E2EFD9" w:themeFill="accent6" w:themeFillTint="33"/>
             <w:vAlign w:val="center"/>
           </w:tcPr>
@@ -1229,7 +1228,7 @@
         </w:tc>
         <w:tc>
           <w:tcPr>
-            <w:tcW w:w="726" w:type="dxa"/>
+            <w:tcW w:w="784" w:type="dxa"/>
             <w:gridSpan w:val="2"/>
             <w:vAlign w:val="center"/>
           </w:tcPr>
@@ -1244,7 +1243,7 @@
         </w:tc>
         <w:tc>
           <w:tcPr>
-            <w:tcW w:w="2096" w:type="dxa"/>
+            <w:tcW w:w="2093" w:type="dxa"/>
             <w:gridSpan w:val="2"/>
           </w:tcPr>
           <w:p>
@@ -1301,7 +1300,7 @@
         </w:tc>
         <w:tc>
           <w:tcPr>
-            <w:tcW w:w="5209" w:type="dxa"/>
+            <w:tcW w:w="5231" w:type="dxa"/>
             <w:gridSpan w:val="4"/>
           </w:tcPr>
           <w:p>
@@ -1332,7 +1331,7 @@
         </w:tc>
         <w:tc>
           <w:tcPr>
-            <w:tcW w:w="848" w:type="dxa"/>
+            <w:tcW w:w="821" w:type="dxa"/>
           </w:tcPr>
           <w:p>
             <w:r>
@@ -1347,7 +1346,7 @@
         </w:tc>
         <w:tc>
           <w:tcPr>
-            <w:tcW w:w="1074" w:type="dxa"/>
+            <w:tcW w:w="1037" w:type="dxa"/>
           </w:tcPr>
           <w:p>
             <w:r>
@@ -1373,7 +1372,7 @@
         </w:trPr>
         <w:tc>
           <w:tcPr>
-            <w:tcW w:w="503" w:type="dxa"/>
+            <w:tcW w:w="490" w:type="dxa"/>
             <w:shd w:val="clear" w:color="auto" w:fill="E2EFD9" w:themeFill="accent6" w:themeFillTint="33"/>
             <w:vAlign w:val="center"/>
           </w:tcPr>
@@ -1394,7 +1393,7 @@
         </w:tc>
         <w:tc>
           <w:tcPr>
-            <w:tcW w:w="726" w:type="dxa"/>
+            <w:tcW w:w="784" w:type="dxa"/>
             <w:gridSpan w:val="2"/>
             <w:vAlign w:val="center"/>
           </w:tcPr>
@@ -1417,7 +1416,7 @@
         </w:tc>
         <w:tc>
           <w:tcPr>
-            <w:tcW w:w="2096" w:type="dxa"/>
+            <w:tcW w:w="2093" w:type="dxa"/>
             <w:gridSpan w:val="2"/>
           </w:tcPr>
           <w:p>
@@ -1464,7 +1463,7 @@
         </w:tc>
         <w:tc>
           <w:tcPr>
-            <w:tcW w:w="5209" w:type="dxa"/>
+            <w:tcW w:w="5231" w:type="dxa"/>
             <w:gridSpan w:val="4"/>
           </w:tcPr>
           <w:p>
@@ -1498,7 +1497,7 @@
         </w:tc>
         <w:tc>
           <w:tcPr>
-            <w:tcW w:w="848" w:type="dxa"/>
+            <w:tcW w:w="821" w:type="dxa"/>
           </w:tcPr>
           <w:p>
             <w:r>
@@ -1508,7 +1507,7 @@
         </w:tc>
         <w:tc>
           <w:tcPr>
-            <w:tcW w:w="1074" w:type="dxa"/>
+            <w:tcW w:w="1037" w:type="dxa"/>
           </w:tcPr>
           <w:p>
             <w:r>
@@ -1526,7 +1525,7 @@
       <w:tr>
         <w:tc>
           <w:tcPr>
-            <w:tcW w:w="503" w:type="dxa"/>
+            <w:tcW w:w="490" w:type="dxa"/>
           </w:tcPr>
           <w:p>
             <w:pPr>
@@ -1544,7 +1543,7 @@
         </w:tc>
         <w:tc>
           <w:tcPr>
-            <w:tcW w:w="726" w:type="dxa"/>
+            <w:tcW w:w="784" w:type="dxa"/>
             <w:gridSpan w:val="2"/>
           </w:tcPr>
           <w:p>
@@ -1563,7 +1562,7 @@
         </w:tc>
         <w:tc>
           <w:tcPr>
-            <w:tcW w:w="2096" w:type="dxa"/>
+            <w:tcW w:w="2093" w:type="dxa"/>
             <w:gridSpan w:val="2"/>
           </w:tcPr>
           <w:p>
@@ -1595,7 +1594,7 @@
         </w:tc>
         <w:tc>
           <w:tcPr>
-            <w:tcW w:w="5209" w:type="dxa"/>
+            <w:tcW w:w="5231" w:type="dxa"/>
             <w:gridSpan w:val="4"/>
           </w:tcPr>
           <w:p>
@@ -3130,7 +3129,7 @@
         </w:tc>
         <w:tc>
           <w:tcPr>
-            <w:tcW w:w="848" w:type="dxa"/>
+            <w:tcW w:w="821" w:type="dxa"/>
           </w:tcPr>
           <w:p>
             <w:pPr>
@@ -3149,7 +3148,7 @@
         </w:tc>
         <w:tc>
           <w:tcPr>
-            <w:tcW w:w="1074" w:type="dxa"/>
+            <w:tcW w:w="1037" w:type="dxa"/>
           </w:tcPr>
           <w:p>
             <w:pPr>
@@ -3174,6 +3173,7 @@
               <w:rPr>
                 <w:color w:val="000000" w:themeColor="text1"/>
               </w:rPr>
+              <w:lastRenderedPageBreak/>
               <w:t>d</w:t>
             </w:r>
             <w:proofErr w:type="spellEnd"/>
@@ -3195,19 +3195,19 @@
       <w:tr>
         <w:tc>
           <w:tcPr>
-            <w:tcW w:w="503" w:type="dxa"/>
-          </w:tcPr>
-          <w:p>
-            <w:pPr>
-              <w:rPr>
-                <w:color w:val="000000" w:themeColor="text1"/>
-              </w:rPr>
-            </w:pPr>
-          </w:p>
-        </w:tc>
-        <w:tc>
-          <w:tcPr>
-            <w:tcW w:w="726" w:type="dxa"/>
+            <w:tcW w:w="490" w:type="dxa"/>
+          </w:tcPr>
+          <w:p>
+            <w:pPr>
+              <w:rPr>
+                <w:color w:val="000000" w:themeColor="text1"/>
+              </w:rPr>
+            </w:pPr>
+          </w:p>
+        </w:tc>
+        <w:tc>
+          <w:tcPr>
+            <w:tcW w:w="784" w:type="dxa"/>
             <w:gridSpan w:val="2"/>
           </w:tcPr>
           <w:p>
@@ -3220,7 +3220,7 @@
         </w:tc>
         <w:tc>
           <w:tcPr>
-            <w:tcW w:w="2096" w:type="dxa"/>
+            <w:tcW w:w="2093" w:type="dxa"/>
             <w:gridSpan w:val="2"/>
           </w:tcPr>
           <w:p>
@@ -3233,7 +3233,7 @@
         </w:tc>
         <w:tc>
           <w:tcPr>
-            <w:tcW w:w="5209" w:type="dxa"/>
+            <w:tcW w:w="5231" w:type="dxa"/>
             <w:gridSpan w:val="4"/>
           </w:tcPr>
           <w:p>
@@ -3246,19 +3246,19 @@
         </w:tc>
         <w:tc>
           <w:tcPr>
-            <w:tcW w:w="848" w:type="dxa"/>
-          </w:tcPr>
-          <w:p>
-            <w:pPr>
-              <w:rPr>
-                <w:color w:val="000000" w:themeColor="text1"/>
-              </w:rPr>
-            </w:pPr>
-          </w:p>
-        </w:tc>
-        <w:tc>
-          <w:tcPr>
-            <w:tcW w:w="1074" w:type="dxa"/>
+            <w:tcW w:w="821" w:type="dxa"/>
+          </w:tcPr>
+          <w:p>
+            <w:pPr>
+              <w:rPr>
+                <w:color w:val="000000" w:themeColor="text1"/>
+              </w:rPr>
+            </w:pPr>
+          </w:p>
+        </w:tc>
+        <w:tc>
+          <w:tcPr>
+            <w:tcW w:w="1037" w:type="dxa"/>
           </w:tcPr>
           <w:p>
             <w:pPr>
@@ -3272,19 +3272,19 @@
       <w:tr>
         <w:tc>
           <w:tcPr>
-            <w:tcW w:w="503" w:type="dxa"/>
-          </w:tcPr>
-          <w:p>
-            <w:pPr>
-              <w:rPr>
-                <w:color w:val="000000" w:themeColor="text1"/>
-              </w:rPr>
-            </w:pPr>
-          </w:p>
-        </w:tc>
-        <w:tc>
-          <w:tcPr>
-            <w:tcW w:w="726" w:type="dxa"/>
+            <w:tcW w:w="490" w:type="dxa"/>
+          </w:tcPr>
+          <w:p>
+            <w:pPr>
+              <w:rPr>
+                <w:color w:val="000000" w:themeColor="text1"/>
+              </w:rPr>
+            </w:pPr>
+          </w:p>
+        </w:tc>
+        <w:tc>
+          <w:tcPr>
+            <w:tcW w:w="784" w:type="dxa"/>
             <w:gridSpan w:val="2"/>
           </w:tcPr>
           <w:p>
@@ -3297,7 +3297,7 @@
         </w:tc>
         <w:tc>
           <w:tcPr>
-            <w:tcW w:w="2096" w:type="dxa"/>
+            <w:tcW w:w="2093" w:type="dxa"/>
             <w:gridSpan w:val="2"/>
           </w:tcPr>
           <w:p>
@@ -3310,7 +3310,7 @@
         </w:tc>
         <w:tc>
           <w:tcPr>
-            <w:tcW w:w="5209" w:type="dxa"/>
+            <w:tcW w:w="5231" w:type="dxa"/>
             <w:gridSpan w:val="4"/>
           </w:tcPr>
           <w:p>
@@ -3323,19 +3323,19 @@
         </w:tc>
         <w:tc>
           <w:tcPr>
-            <w:tcW w:w="848" w:type="dxa"/>
-          </w:tcPr>
-          <w:p>
-            <w:pPr>
-              <w:rPr>
-                <w:color w:val="000000" w:themeColor="text1"/>
-              </w:rPr>
-            </w:pPr>
-          </w:p>
-        </w:tc>
-        <w:tc>
-          <w:tcPr>
-            <w:tcW w:w="1074" w:type="dxa"/>
+            <w:tcW w:w="821" w:type="dxa"/>
+          </w:tcPr>
+          <w:p>
+            <w:pPr>
+              <w:rPr>
+                <w:color w:val="000000" w:themeColor="text1"/>
+              </w:rPr>
+            </w:pPr>
+          </w:p>
+        </w:tc>
+        <w:tc>
+          <w:tcPr>
+            <w:tcW w:w="1037" w:type="dxa"/>
           </w:tcPr>
           <w:p>
             <w:pPr>
@@ -3349,19 +3349,19 @@
       <w:tr>
         <w:tc>
           <w:tcPr>
-            <w:tcW w:w="503" w:type="dxa"/>
-          </w:tcPr>
-          <w:p>
-            <w:pPr>
-              <w:rPr>
-                <w:color w:val="000000" w:themeColor="text1"/>
-              </w:rPr>
-            </w:pPr>
-          </w:p>
-        </w:tc>
-        <w:tc>
-          <w:tcPr>
-            <w:tcW w:w="726" w:type="dxa"/>
+            <w:tcW w:w="490" w:type="dxa"/>
+          </w:tcPr>
+          <w:p>
+            <w:pPr>
+              <w:rPr>
+                <w:color w:val="000000" w:themeColor="text1"/>
+              </w:rPr>
+            </w:pPr>
+          </w:p>
+        </w:tc>
+        <w:tc>
+          <w:tcPr>
+            <w:tcW w:w="784" w:type="dxa"/>
             <w:gridSpan w:val="2"/>
           </w:tcPr>
           <w:p>
@@ -3374,7 +3374,7 @@
         </w:tc>
         <w:tc>
           <w:tcPr>
-            <w:tcW w:w="2096" w:type="dxa"/>
+            <w:tcW w:w="2093" w:type="dxa"/>
             <w:gridSpan w:val="2"/>
           </w:tcPr>
           <w:p>
@@ -3387,7 +3387,7 @@
         </w:tc>
         <w:tc>
           <w:tcPr>
-            <w:tcW w:w="5209" w:type="dxa"/>
+            <w:tcW w:w="5231" w:type="dxa"/>
             <w:gridSpan w:val="4"/>
           </w:tcPr>
           <w:p>
@@ -3400,19 +3400,19 @@
         </w:tc>
         <w:tc>
           <w:tcPr>
-            <w:tcW w:w="848" w:type="dxa"/>
-          </w:tcPr>
-          <w:p>
-            <w:pPr>
-              <w:rPr>
-                <w:color w:val="000000" w:themeColor="text1"/>
-              </w:rPr>
-            </w:pPr>
-          </w:p>
-        </w:tc>
-        <w:tc>
-          <w:tcPr>
-            <w:tcW w:w="1074" w:type="dxa"/>
+            <w:tcW w:w="821" w:type="dxa"/>
+          </w:tcPr>
+          <w:p>
+            <w:pPr>
+              <w:rPr>
+                <w:color w:val="000000" w:themeColor="text1"/>
+              </w:rPr>
+            </w:pPr>
+          </w:p>
+        </w:tc>
+        <w:tc>
+          <w:tcPr>
+            <w:tcW w:w="1037" w:type="dxa"/>
           </w:tcPr>
           <w:p>
             <w:pPr>
@@ -3426,19 +3426,19 @@
       <w:tr>
         <w:tc>
           <w:tcPr>
-            <w:tcW w:w="503" w:type="dxa"/>
-          </w:tcPr>
-          <w:p>
-            <w:pPr>
-              <w:rPr>
-                <w:color w:val="000000" w:themeColor="text1"/>
-              </w:rPr>
-            </w:pPr>
-          </w:p>
-        </w:tc>
-        <w:tc>
-          <w:tcPr>
-            <w:tcW w:w="726" w:type="dxa"/>
+            <w:tcW w:w="490" w:type="dxa"/>
+          </w:tcPr>
+          <w:p>
+            <w:pPr>
+              <w:rPr>
+                <w:color w:val="000000" w:themeColor="text1"/>
+              </w:rPr>
+            </w:pPr>
+          </w:p>
+        </w:tc>
+        <w:tc>
+          <w:tcPr>
+            <w:tcW w:w="784" w:type="dxa"/>
             <w:gridSpan w:val="2"/>
           </w:tcPr>
           <w:p>
@@ -3451,7 +3451,7 @@
         </w:tc>
         <w:tc>
           <w:tcPr>
-            <w:tcW w:w="2096" w:type="dxa"/>
+            <w:tcW w:w="2093" w:type="dxa"/>
             <w:gridSpan w:val="2"/>
           </w:tcPr>
           <w:p>
@@ -3464,7 +3464,7 @@
         </w:tc>
         <w:tc>
           <w:tcPr>
-            <w:tcW w:w="5209" w:type="dxa"/>
+            <w:tcW w:w="5231" w:type="dxa"/>
             <w:gridSpan w:val="4"/>
           </w:tcPr>
           <w:p>
@@ -3477,19 +3477,19 @@
         </w:tc>
         <w:tc>
           <w:tcPr>
-            <w:tcW w:w="848" w:type="dxa"/>
-          </w:tcPr>
-          <w:p>
-            <w:pPr>
-              <w:rPr>
-                <w:color w:val="000000" w:themeColor="text1"/>
-              </w:rPr>
-            </w:pPr>
-          </w:p>
-        </w:tc>
-        <w:tc>
-          <w:tcPr>
-            <w:tcW w:w="1074" w:type="dxa"/>
+            <w:tcW w:w="821" w:type="dxa"/>
+          </w:tcPr>
+          <w:p>
+            <w:pPr>
+              <w:rPr>
+                <w:color w:val="000000" w:themeColor="text1"/>
+              </w:rPr>
+            </w:pPr>
+          </w:p>
+        </w:tc>
+        <w:tc>
+          <w:tcPr>
+            <w:tcW w:w="1037" w:type="dxa"/>
           </w:tcPr>
           <w:p>
             <w:pPr>
@@ -3503,19 +3503,19 @@
       <w:tr>
         <w:tc>
           <w:tcPr>
-            <w:tcW w:w="503" w:type="dxa"/>
-          </w:tcPr>
-          <w:p>
-            <w:pPr>
-              <w:rPr>
-                <w:color w:val="000000" w:themeColor="text1"/>
-              </w:rPr>
-            </w:pPr>
-          </w:p>
-        </w:tc>
-        <w:tc>
-          <w:tcPr>
-            <w:tcW w:w="726" w:type="dxa"/>
+            <w:tcW w:w="490" w:type="dxa"/>
+          </w:tcPr>
+          <w:p>
+            <w:pPr>
+              <w:rPr>
+                <w:color w:val="000000" w:themeColor="text1"/>
+              </w:rPr>
+            </w:pPr>
+          </w:p>
+        </w:tc>
+        <w:tc>
+          <w:tcPr>
+            <w:tcW w:w="784" w:type="dxa"/>
             <w:gridSpan w:val="2"/>
           </w:tcPr>
           <w:p>
@@ -3528,7 +3528,7 @@
         </w:tc>
         <w:tc>
           <w:tcPr>
-            <w:tcW w:w="2096" w:type="dxa"/>
+            <w:tcW w:w="2093" w:type="dxa"/>
             <w:gridSpan w:val="2"/>
           </w:tcPr>
           <w:p>
@@ -3541,7 +3541,7 @@
         </w:tc>
         <w:tc>
           <w:tcPr>
-            <w:tcW w:w="5209" w:type="dxa"/>
+            <w:tcW w:w="5231" w:type="dxa"/>
             <w:gridSpan w:val="4"/>
           </w:tcPr>
           <w:p>
@@ -3554,19 +3554,19 @@
         </w:tc>
         <w:tc>
           <w:tcPr>
-            <w:tcW w:w="848" w:type="dxa"/>
-          </w:tcPr>
-          <w:p>
-            <w:pPr>
-              <w:rPr>
-                <w:color w:val="000000" w:themeColor="text1"/>
-              </w:rPr>
-            </w:pPr>
-          </w:p>
-        </w:tc>
-        <w:tc>
-          <w:tcPr>
-            <w:tcW w:w="1074" w:type="dxa"/>
+            <w:tcW w:w="821" w:type="dxa"/>
+          </w:tcPr>
+          <w:p>
+            <w:pPr>
+              <w:rPr>
+                <w:color w:val="000000" w:themeColor="text1"/>
+              </w:rPr>
+            </w:pPr>
+          </w:p>
+        </w:tc>
+        <w:tc>
+          <w:tcPr>
+            <w:tcW w:w="1037" w:type="dxa"/>
           </w:tcPr>
           <w:p>
             <w:pPr>
@@ -3583,7 +3583,7 @@
         </w:trPr>
         <w:tc>
           <w:tcPr>
-            <w:tcW w:w="1018" w:type="dxa"/>
+            <w:tcW w:w="1033" w:type="dxa"/>
             <w:gridSpan w:val="2"/>
             <w:shd w:val="clear" w:color="auto" w:fill="D9E2F3" w:themeFill="accent1" w:themeFillTint="33"/>
           </w:tcPr>
@@ -3605,7 +3605,7 @@
         </w:tc>
         <w:tc>
           <w:tcPr>
-            <w:tcW w:w="1192" w:type="dxa"/>
+            <w:tcW w:w="1449" w:type="dxa"/>
             <w:gridSpan w:val="2"/>
             <w:shd w:val="clear" w:color="auto" w:fill="FFF2CC" w:themeFill="accent4" w:themeFillTint="33"/>
           </w:tcPr>
@@ -3627,7 +3627,7 @@
         </w:tc>
         <w:tc>
           <w:tcPr>
-            <w:tcW w:w="1412" w:type="dxa"/>
+            <w:tcW w:w="1211" w:type="dxa"/>
             <w:gridSpan w:val="2"/>
             <w:shd w:val="clear" w:color="auto" w:fill="FFF2CC" w:themeFill="accent4" w:themeFillTint="33"/>
           </w:tcPr>
@@ -3663,7 +3663,7 @@
         </w:tc>
         <w:tc>
           <w:tcPr>
-            <w:tcW w:w="2373" w:type="dxa"/>
+            <w:tcW w:w="2540" w:type="dxa"/>
             <w:shd w:val="clear" w:color="auto" w:fill="FFF2CC" w:themeFill="accent4" w:themeFillTint="33"/>
           </w:tcPr>
           <w:p>
@@ -3684,7 +3684,7 @@
         </w:tc>
         <w:tc>
           <w:tcPr>
-            <w:tcW w:w="2341" w:type="dxa"/>
+            <w:tcW w:w="2102" w:type="dxa"/>
             <w:shd w:val="clear" w:color="auto" w:fill="FFF2CC" w:themeFill="accent4" w:themeFillTint="33"/>
           </w:tcPr>
           <w:p>
@@ -3718,7 +3718,7 @@
         </w:tc>
         <w:tc>
           <w:tcPr>
-            <w:tcW w:w="2120" w:type="dxa"/>
+            <w:tcW w:w="2121" w:type="dxa"/>
             <w:gridSpan w:val="3"/>
             <w:shd w:val="clear" w:color="auto" w:fill="FFF2CC" w:themeFill="accent4" w:themeFillTint="33"/>
           </w:tcPr>
@@ -3750,7 +3750,7 @@
         </w:trPr>
         <w:tc>
           <w:tcPr>
-            <w:tcW w:w="1018" w:type="dxa"/>
+            <w:tcW w:w="1033" w:type="dxa"/>
             <w:gridSpan w:val="2"/>
             <w:shd w:val="clear" w:color="auto" w:fill="E2EFD9" w:themeFill="accent6" w:themeFillTint="33"/>
             <w:vAlign w:val="center"/>
@@ -3772,7 +3772,7 @@
         </w:tc>
         <w:tc>
           <w:tcPr>
-            <w:tcW w:w="1192" w:type="dxa"/>
+            <w:tcW w:w="1449" w:type="dxa"/>
             <w:gridSpan w:val="2"/>
             <w:vAlign w:val="center"/>
           </w:tcPr>
@@ -3784,7 +3784,7 @@
         </w:tc>
         <w:tc>
           <w:tcPr>
-            <w:tcW w:w="1412" w:type="dxa"/>
+            <w:tcW w:w="1211" w:type="dxa"/>
             <w:gridSpan w:val="2"/>
           </w:tcPr>
           <w:p>
@@ -3795,7 +3795,7 @@
         </w:tc>
         <w:tc>
           <w:tcPr>
-            <w:tcW w:w="2373" w:type="dxa"/>
+            <w:tcW w:w="2540" w:type="dxa"/>
           </w:tcPr>
           <w:p>
             <w:r>
@@ -3805,7 +3805,7 @@
         </w:tc>
         <w:tc>
           <w:tcPr>
-            <w:tcW w:w="2341" w:type="dxa"/>
+            <w:tcW w:w="2102" w:type="dxa"/>
           </w:tcPr>
           <w:p>
             <w:r>
@@ -3815,7 +3815,7 @@
         </w:tc>
         <w:tc>
           <w:tcPr>
-            <w:tcW w:w="2120" w:type="dxa"/>
+            <w:tcW w:w="2121" w:type="dxa"/>
             <w:gridSpan w:val="3"/>
           </w:tcPr>
           <w:p>
@@ -3831,7 +3831,7 @@
         </w:trPr>
         <w:tc>
           <w:tcPr>
-            <w:tcW w:w="1018" w:type="dxa"/>
+            <w:tcW w:w="1033" w:type="dxa"/>
             <w:gridSpan w:val="2"/>
             <w:shd w:val="clear" w:color="auto" w:fill="E2EFD9" w:themeFill="accent6" w:themeFillTint="33"/>
             <w:vAlign w:val="center"/>
@@ -3850,7 +3850,7 @@
         </w:tc>
         <w:tc>
           <w:tcPr>
-            <w:tcW w:w="1192" w:type="dxa"/>
+            <w:tcW w:w="1449" w:type="dxa"/>
             <w:gridSpan w:val="2"/>
             <w:vAlign w:val="center"/>
           </w:tcPr>
@@ -3865,7 +3865,7 @@
         </w:tc>
         <w:tc>
           <w:tcPr>
-            <w:tcW w:w="1412" w:type="dxa"/>
+            <w:tcW w:w="1211" w:type="dxa"/>
             <w:gridSpan w:val="2"/>
           </w:tcPr>
           <w:p>
@@ -3893,7 +3893,7 @@
         </w:tc>
         <w:tc>
           <w:tcPr>
-            <w:tcW w:w="2373" w:type="dxa"/>
+            <w:tcW w:w="2540" w:type="dxa"/>
           </w:tcPr>
           <w:p>
             <w:r>
@@ -3903,7 +3903,7 @@
         </w:tc>
         <w:tc>
           <w:tcPr>
-            <w:tcW w:w="2341" w:type="dxa"/>
+            <w:tcW w:w="2102" w:type="dxa"/>
           </w:tcPr>
           <w:p>
             <w:r>
@@ -3913,7 +3913,7 @@
         </w:tc>
         <w:tc>
           <w:tcPr>
-            <w:tcW w:w="2120" w:type="dxa"/>
+            <w:tcW w:w="2121" w:type="dxa"/>
             <w:gridSpan w:val="3"/>
           </w:tcPr>
           <w:p>
@@ -3929,7 +3929,7 @@
         </w:trPr>
         <w:tc>
           <w:tcPr>
-            <w:tcW w:w="1018" w:type="dxa"/>
+            <w:tcW w:w="1033" w:type="dxa"/>
             <w:gridSpan w:val="2"/>
             <w:shd w:val="clear" w:color="auto" w:fill="E2EFD9" w:themeFill="accent6" w:themeFillTint="33"/>
             <w:vAlign w:val="center"/>
@@ -3948,7 +3948,7 @@
         </w:tc>
         <w:tc>
           <w:tcPr>
-            <w:tcW w:w="1192" w:type="dxa"/>
+            <w:tcW w:w="1449" w:type="dxa"/>
             <w:gridSpan w:val="2"/>
             <w:vAlign w:val="center"/>
           </w:tcPr>
@@ -3963,7 +3963,7 @@
         </w:tc>
         <w:tc>
           <w:tcPr>
-            <w:tcW w:w="1412" w:type="dxa"/>
+            <w:tcW w:w="1211" w:type="dxa"/>
             <w:gridSpan w:val="2"/>
           </w:tcPr>
           <w:p>
@@ -3983,7 +3983,7 @@
         </w:tc>
         <w:tc>
           <w:tcPr>
-            <w:tcW w:w="2373" w:type="dxa"/>
+            <w:tcW w:w="2540" w:type="dxa"/>
           </w:tcPr>
           <w:p>
             <w:r>
@@ -3993,7 +3993,7 @@
         </w:tc>
         <w:tc>
           <w:tcPr>
-            <w:tcW w:w="2341" w:type="dxa"/>
+            <w:tcW w:w="2102" w:type="dxa"/>
           </w:tcPr>
           <w:p>
             <w:r>
@@ -4003,7 +4003,7 @@
         </w:tc>
         <w:tc>
           <w:tcPr>
-            <w:tcW w:w="2120" w:type="dxa"/>
+            <w:tcW w:w="2121" w:type="dxa"/>
             <w:gridSpan w:val="3"/>
           </w:tcPr>
           <w:p>
@@ -4019,7 +4019,7 @@
         </w:trPr>
         <w:tc>
           <w:tcPr>
-            <w:tcW w:w="1018" w:type="dxa"/>
+            <w:tcW w:w="1033" w:type="dxa"/>
             <w:gridSpan w:val="2"/>
             <w:shd w:val="clear" w:color="auto" w:fill="E2EFD9" w:themeFill="accent6" w:themeFillTint="33"/>
             <w:vAlign w:val="center"/>
@@ -4041,7 +4041,7 @@
         </w:tc>
         <w:tc>
           <w:tcPr>
-            <w:tcW w:w="1192" w:type="dxa"/>
+            <w:tcW w:w="1449" w:type="dxa"/>
             <w:gridSpan w:val="2"/>
             <w:vAlign w:val="center"/>
           </w:tcPr>
@@ -4059,7 +4059,7 @@
         </w:tc>
         <w:tc>
           <w:tcPr>
-            <w:tcW w:w="1412" w:type="dxa"/>
+            <w:tcW w:w="1211" w:type="dxa"/>
             <w:gridSpan w:val="2"/>
           </w:tcPr>
           <w:p>
@@ -4070,7 +4070,7 @@
         </w:tc>
         <w:tc>
           <w:tcPr>
-            <w:tcW w:w="2373" w:type="dxa"/>
+            <w:tcW w:w="2540" w:type="dxa"/>
           </w:tcPr>
           <w:p>
             <w:r>
@@ -4080,7 +4080,7 @@
         </w:tc>
         <w:tc>
           <w:tcPr>
-            <w:tcW w:w="2341" w:type="dxa"/>
+            <w:tcW w:w="2102" w:type="dxa"/>
           </w:tcPr>
           <w:p>
             <w:r>
@@ -4090,12 +4090,1518 @@
         </w:tc>
         <w:tc>
           <w:tcPr>
-            <w:tcW w:w="2120" w:type="dxa"/>
+            <w:tcW w:w="2121" w:type="dxa"/>
             <w:gridSpan w:val="3"/>
           </w:tcPr>
           <w:p>
             <w:r>
               <w:t>Tested plots and confirmed they reflect expected relationships</w:t>
+            </w:r>
+          </w:p>
+        </w:tc>
+      </w:tr>
+      <w:tr>
+        <w:trPr>
+          <w:trHeight w:val="1134"/>
+        </w:trPr>
+        <w:tc>
+          <w:tcPr>
+            <w:tcW w:w="1033" w:type="dxa"/>
+            <w:gridSpan w:val="2"/>
+            <w:shd w:val="clear" w:color="auto" w:fill="E2EFD9" w:themeFill="accent6" w:themeFillTint="33"/>
+            <w:vAlign w:val="center"/>
+          </w:tcPr>
+          <w:p>
+            <w:pPr>
+              <w:jc w:val="center"/>
+              <w:rPr>
+                <w:color w:val="2F5496" w:themeColor="accent1" w:themeShade="BF"/>
+              </w:rPr>
+            </w:pPr>
+          </w:p>
+        </w:tc>
+        <w:tc>
+          <w:tcPr>
+            <w:tcW w:w="1449" w:type="dxa"/>
+            <w:gridSpan w:val="2"/>
+            <w:vAlign w:val="center"/>
+          </w:tcPr>
+          <w:p>
+            <w:pPr>
+              <w:jc w:val="center"/>
+            </w:pPr>
+          </w:p>
+        </w:tc>
+        <w:tc>
+          <w:tcPr>
+            <w:tcW w:w="1211" w:type="dxa"/>
+            <w:gridSpan w:val="2"/>
+          </w:tcPr>
+          <w:p/>
+        </w:tc>
+        <w:tc>
+          <w:tcPr>
+            <w:tcW w:w="2540" w:type="dxa"/>
+          </w:tcPr>
+          <w:p/>
+        </w:tc>
+        <w:tc>
+          <w:tcPr>
+            <w:tcW w:w="2102" w:type="dxa"/>
+          </w:tcPr>
+          <w:p/>
+        </w:tc>
+        <w:tc>
+          <w:tcPr>
+            <w:tcW w:w="2121" w:type="dxa"/>
+            <w:gridSpan w:val="3"/>
+          </w:tcPr>
+          <w:p/>
+        </w:tc>
+      </w:tr>
+    </w:tbl>
+    <w:p/>
+    <w:tbl>
+      <w:tblPr>
+        <w:tblStyle w:val="TableGrid"/>
+        <w:tblW w:w="10539" w:type="dxa"/>
+        <w:tblLook w:val="04A0" w:firstRow="1" w:lastRow="0" w:firstColumn="1" w:lastColumn="0" w:noHBand="0" w:noVBand="1"/>
+      </w:tblPr>
+      <w:tblGrid>
+        <w:gridCol w:w="1055"/>
+        <w:gridCol w:w="830"/>
+        <w:gridCol w:w="715"/>
+        <w:gridCol w:w="3163"/>
+        <w:gridCol w:w="2086"/>
+        <w:gridCol w:w="3987"/>
+      </w:tblGrid>
+      <w:tr>
+        <w:trPr>
+          <w:trHeight w:val="297"/>
+        </w:trPr>
+        <w:tc>
+          <w:tcPr>
+            <w:tcW w:w="1063" w:type="dxa"/>
+            <w:shd w:val="clear" w:color="auto" w:fill="D9E2F3" w:themeFill="accent1" w:themeFillTint="33"/>
+          </w:tcPr>
+          <w:p>
+            <w:pPr>
+              <w:rPr>
+                <w:b/>
+                <w:bCs/>
+              </w:rPr>
+            </w:pPr>
+            <w:r>
+              <w:rPr>
+                <w:b/>
+                <w:bCs/>
+              </w:rPr>
+              <w:t>Date of use</w:t>
+            </w:r>
+          </w:p>
+        </w:tc>
+        <w:tc>
+          <w:tcPr>
+            <w:tcW w:w="909" w:type="dxa"/>
+            <w:shd w:val="clear" w:color="auto" w:fill="FFF2CC" w:themeFill="accent4" w:themeFillTint="33"/>
+          </w:tcPr>
+          <w:p>
+            <w:pPr>
+              <w:rPr>
+                <w:b/>
+                <w:bCs/>
+              </w:rPr>
+            </w:pPr>
+            <w:r>
+              <w:rPr>
+                <w:b/>
+                <w:bCs/>
+              </w:rPr>
+              <w:t>Tool used</w:t>
+            </w:r>
+          </w:p>
+        </w:tc>
+        <w:tc>
+          <w:tcPr>
+            <w:tcW w:w="860" w:type="dxa"/>
+            <w:shd w:val="clear" w:color="auto" w:fill="FFF2CC" w:themeFill="accent4" w:themeFillTint="33"/>
+          </w:tcPr>
+          <w:p>
+            <w:pPr>
+              <w:rPr>
+                <w:b/>
+                <w:bCs/>
+              </w:rPr>
+            </w:pPr>
+            <w:r>
+              <w:rPr>
+                <w:b/>
+                <w:bCs/>
+              </w:rPr>
+              <w:t>T</w:t>
+            </w:r>
+            <w:r>
+              <w:rPr>
+                <w:b/>
+                <w:bCs/>
+              </w:rPr>
+              <w:t>asks</w:t>
+            </w:r>
+            <w:r>
+              <w:rPr>
+                <w:b/>
+                <w:bCs/>
+              </w:rPr>
+              <w:t xml:space="preserve"> </w:t>
+            </w:r>
+          </w:p>
+        </w:tc>
+        <w:tc>
+          <w:tcPr>
+            <w:tcW w:w="1535" w:type="dxa"/>
+            <w:shd w:val="clear" w:color="auto" w:fill="FFF2CC" w:themeFill="accent4" w:themeFillTint="33"/>
+          </w:tcPr>
+          <w:p>
+            <w:pPr>
+              <w:rPr>
+                <w:b/>
+                <w:bCs/>
+              </w:rPr>
+            </w:pPr>
+            <w:r>
+              <w:rPr>
+                <w:b/>
+                <w:bCs/>
+              </w:rPr>
+              <w:t>Prompts (copy/paste or summarize)</w:t>
+            </w:r>
+          </w:p>
+        </w:tc>
+        <w:tc>
+          <w:tcPr>
+            <w:tcW w:w="2153" w:type="dxa"/>
+            <w:shd w:val="clear" w:color="auto" w:fill="FFF2CC" w:themeFill="accent4" w:themeFillTint="33"/>
+          </w:tcPr>
+          <w:p>
+            <w:pPr>
+              <w:rPr>
+                <w:b/>
+                <w:bCs/>
+              </w:rPr>
+            </w:pPr>
+            <w:r>
+              <w:rPr>
+                <w:b/>
+                <w:bCs/>
+              </w:rPr>
+              <w:t>How was the output used?</w:t>
+            </w:r>
+          </w:p>
+          <w:p>
+            <w:r>
+              <w:t>Directly / modified / for inspiration / not used</w:t>
+            </w:r>
+          </w:p>
+          <w:p>
+            <w:pPr>
+              <w:rPr>
+                <w:b/>
+                <w:bCs/>
+              </w:rPr>
+            </w:pPr>
+          </w:p>
+        </w:tc>
+        <w:tc>
+          <w:tcPr>
+            <w:tcW w:w="4019" w:type="dxa"/>
+            <w:shd w:val="clear" w:color="auto" w:fill="FFF2CC" w:themeFill="accent4" w:themeFillTint="33"/>
+          </w:tcPr>
+          <w:p>
+            <w:pPr>
+              <w:rPr>
+                <w:b/>
+                <w:bCs/>
+              </w:rPr>
+            </w:pPr>
+            <w:r>
+              <w:rPr>
+                <w:b/>
+                <w:bCs/>
+              </w:rPr>
+              <w:t>Verification</w:t>
+            </w:r>
+          </w:p>
+          <w:p>
+            <w:r>
+              <w:t xml:space="preserve">How did you check correctness? </w:t>
+            </w:r>
+          </w:p>
+        </w:tc>
+      </w:tr>
+      <w:tr>
+        <w:trPr>
+          <w:trHeight w:val="1249"/>
+        </w:trPr>
+        <w:tc>
+          <w:tcPr>
+            <w:tcW w:w="1063" w:type="dxa"/>
+            <w:shd w:val="clear" w:color="auto" w:fill="E2EFD9" w:themeFill="accent6" w:themeFillTint="33"/>
+            <w:vAlign w:val="center"/>
+          </w:tcPr>
+          <w:p>
+            <w:pPr>
+              <w:jc w:val="center"/>
+              <w:rPr>
+                <w:color w:val="2F5496" w:themeColor="accent1" w:themeShade="BF"/>
+              </w:rPr>
+            </w:pPr>
+            <w:r>
+              <w:rPr>
+                <w:color w:val="2F5496" w:themeColor="accent1" w:themeShade="BF"/>
+              </w:rPr>
+              <w:t>1</w:t>
+            </w:r>
+            <w:r>
+              <w:rPr>
+                <w:color w:val="2F5496" w:themeColor="accent1" w:themeShade="BF"/>
+              </w:rPr>
+              <w:t>5</w:t>
+            </w:r>
+            <w:r>
+              <w:rPr>
+                <w:color w:val="2F5496" w:themeColor="accent1" w:themeShade="BF"/>
+              </w:rPr>
+              <w:t>/03/26</w:t>
+            </w:r>
+          </w:p>
+        </w:tc>
+        <w:tc>
+          <w:tcPr>
+            <w:tcW w:w="909" w:type="dxa"/>
+            <w:vAlign w:val="center"/>
+          </w:tcPr>
+          <w:p>
+            <w:r>
+              <w:t>Claude</w:t>
+            </w:r>
+          </w:p>
+        </w:tc>
+        <w:tc>
+          <w:tcPr>
+            <w:tcW w:w="860" w:type="dxa"/>
+          </w:tcPr>
+          <w:p>
+            <w:r>
+              <w:t xml:space="preserve">- </w:t>
+            </w:r>
+            <w:r>
+              <w:rPr>
+                <w:color w:val="2F5496" w:themeColor="accent1" w:themeShade="BF"/>
+              </w:rPr>
+              <w:t>…</w:t>
+            </w:r>
+          </w:p>
+          <w:p>
+            <w:r>
+              <w:t xml:space="preserve">- </w:t>
+            </w:r>
+            <w:r>
+              <w:rPr>
+                <w:color w:val="2F5496" w:themeColor="accent1" w:themeShade="BF"/>
+              </w:rPr>
+              <w:t>…</w:t>
+            </w:r>
+          </w:p>
+          <w:p>
+            <w:r>
+              <w:t xml:space="preserve">- </w:t>
+            </w:r>
+            <w:r>
+              <w:rPr>
+                <w:color w:val="2F5496" w:themeColor="accent1" w:themeShade="BF"/>
+              </w:rPr>
+              <w:t>…</w:t>
+            </w:r>
+          </w:p>
+          <w:p>
+            <w:r>
+              <w:t xml:space="preserve">- </w:t>
+            </w:r>
+            <w:r>
+              <w:rPr>
+                <w:color w:val="2F5496" w:themeColor="accent1" w:themeShade="BF"/>
+              </w:rPr>
+              <w:t>…</w:t>
+            </w:r>
+          </w:p>
+        </w:tc>
+        <w:tc>
+          <w:tcPr>
+            <w:tcW w:w="1535" w:type="dxa"/>
+          </w:tcPr>
+          <w:p>
+            <w:r>
+              <w:t xml:space="preserve">How do I setup a flexible file path that is not just specific to my local machine but one that my partners can use. I need to access a file in a specific location of a directory that is the same for all group member within the ‘Fitbit-Project’ directory but whatever </w:t>
+            </w:r>
+            <w:proofErr w:type="spellStart"/>
+            <w:r>
+              <w:t>preceeds</w:t>
+            </w:r>
+            <w:proofErr w:type="spellEnd"/>
+            <w:r>
+              <w:t xml:space="preserve"> that could be different.  </w:t>
+            </w:r>
+          </w:p>
+        </w:tc>
+        <w:tc>
+          <w:tcPr>
+            <w:tcW w:w="2153" w:type="dxa"/>
+          </w:tcPr>
+          <w:p>
+            <w:r>
+              <w:t xml:space="preserve">The output was modified slightly to align with the structure of our repo directory and names of specific files were added. </w:t>
+            </w:r>
+          </w:p>
+        </w:tc>
+        <w:tc>
+          <w:tcPr>
+            <w:tcW w:w="4019" w:type="dxa"/>
+          </w:tcPr>
+          <w:p>
+            <w:r>
+              <w:t xml:space="preserve">I ran the code until no errors arose the </w:t>
+            </w:r>
+            <w:proofErr w:type="spellStart"/>
+            <w:r>
+              <w:t>the</w:t>
+            </w:r>
+            <w:proofErr w:type="spellEnd"/>
+            <w:r>
+              <w:t xml:space="preserve"> </w:t>
+            </w:r>
+            <w:proofErr w:type="spellStart"/>
+            <w:proofErr w:type="gramStart"/>
+            <w:r>
+              <w:t>pd.read</w:t>
+            </w:r>
+            <w:proofErr w:type="gramEnd"/>
+            <w:r>
+              <w:t>_</w:t>
+            </w:r>
+            <w:proofErr w:type="gramStart"/>
+            <w:r>
+              <w:t>csv</w:t>
+            </w:r>
+            <w:proofErr w:type="spellEnd"/>
+            <w:r>
+              <w:t>(</w:t>
+            </w:r>
+            <w:proofErr w:type="gramEnd"/>
+            <w:r>
+              <w:t xml:space="preserve">) method functioned correctly. </w:t>
+            </w:r>
+          </w:p>
+        </w:tc>
+      </w:tr>
+      <w:tr>
+        <w:trPr>
+          <w:trHeight w:val="1249"/>
+        </w:trPr>
+        <w:tc>
+          <w:tcPr>
+            <w:tcW w:w="1063" w:type="dxa"/>
+            <w:shd w:val="clear" w:color="auto" w:fill="E2EFD9" w:themeFill="accent6" w:themeFillTint="33"/>
+            <w:vAlign w:val="center"/>
+          </w:tcPr>
+          <w:p>
+            <w:pPr>
+              <w:jc w:val="center"/>
+            </w:pPr>
+            <w:r>
+              <w:t>16/03/26</w:t>
+            </w:r>
+          </w:p>
+        </w:tc>
+        <w:tc>
+          <w:tcPr>
+            <w:tcW w:w="909" w:type="dxa"/>
+            <w:vAlign w:val="center"/>
+          </w:tcPr>
+          <w:p>
+            <w:r>
+              <w:t>Claude</w:t>
+            </w:r>
+          </w:p>
+        </w:tc>
+        <w:tc>
+          <w:tcPr>
+            <w:tcW w:w="860" w:type="dxa"/>
+          </w:tcPr>
+          <w:p>
+            <w:r>
+              <w:t xml:space="preserve">- </w:t>
+            </w:r>
+            <w:r>
+              <w:rPr>
+                <w:color w:val="2F5496" w:themeColor="accent1" w:themeShade="BF"/>
+              </w:rPr>
+              <w:t>…</w:t>
+            </w:r>
+          </w:p>
+          <w:p>
+            <w:r>
+              <w:t xml:space="preserve">- </w:t>
+            </w:r>
+            <w:r>
+              <w:rPr>
+                <w:color w:val="2F5496" w:themeColor="accent1" w:themeShade="BF"/>
+              </w:rPr>
+              <w:t>…</w:t>
+            </w:r>
+          </w:p>
+          <w:p>
+            <w:r>
+              <w:t xml:space="preserve">- </w:t>
+            </w:r>
+            <w:r>
+              <w:rPr>
+                <w:color w:val="2F5496" w:themeColor="accent1" w:themeShade="BF"/>
+              </w:rPr>
+              <w:t>…</w:t>
+            </w:r>
+          </w:p>
+          <w:p>
+            <w:r>
+              <w:t xml:space="preserve">- </w:t>
+            </w:r>
+            <w:r>
+              <w:rPr>
+                <w:color w:val="2F5496" w:themeColor="accent1" w:themeShade="BF"/>
+              </w:rPr>
+              <w:t>…</w:t>
+            </w:r>
+          </w:p>
+        </w:tc>
+        <w:tc>
+          <w:tcPr>
+            <w:tcW w:w="1535" w:type="dxa"/>
+          </w:tcPr>
+          <w:p>
+            <w:r>
+              <w:t>H</w:t>
+            </w:r>
+            <w:r>
+              <w:t>ow to check for the names of all tables in a sqlite3 database using python</w:t>
+            </w:r>
+          </w:p>
+          <w:p/>
+          <w:p>
+            <w:r>
+              <w:t xml:space="preserve">How to standardize a date format into </w:t>
+            </w:r>
+            <w:proofErr w:type="gramStart"/>
+            <w:r>
+              <w:t>pandas</w:t>
+            </w:r>
+            <w:proofErr w:type="gramEnd"/>
+            <w:r>
+              <w:t xml:space="preserve"> date format</w:t>
+            </w:r>
+          </w:p>
+          <w:p/>
+          <w:p>
+            <w:r>
+              <w:t xml:space="preserve">How to rename a specific column of a pandas </w:t>
+            </w:r>
+            <w:proofErr w:type="spellStart"/>
+            <w:r>
+              <w:t>dataframe</w:t>
+            </w:r>
+            <w:proofErr w:type="spellEnd"/>
+          </w:p>
+        </w:tc>
+        <w:tc>
+          <w:tcPr>
+            <w:tcW w:w="2153" w:type="dxa"/>
+          </w:tcPr>
+          <w:p>
+            <w:r>
+              <w:t xml:space="preserve">The exact query </w:t>
+            </w:r>
+            <w:proofErr w:type="spellStart"/>
+            <w:r>
+              <w:t>claude</w:t>
+            </w:r>
+            <w:proofErr w:type="spellEnd"/>
+            <w:r>
+              <w:t xml:space="preserve"> provided was used. </w:t>
+            </w:r>
+          </w:p>
+          <w:p/>
+          <w:p/>
+          <w:p/>
+          <w:p>
+            <w:proofErr w:type="gramStart"/>
+            <w:r>
+              <w:t>The .</w:t>
+            </w:r>
+            <w:proofErr w:type="spellStart"/>
+            <w:r>
+              <w:t>dt</w:t>
+            </w:r>
+            <w:proofErr w:type="gramEnd"/>
+            <w:r>
+              <w:t>.date</w:t>
+            </w:r>
+            <w:proofErr w:type="spellEnd"/>
+            <w:r>
+              <w:t xml:space="preserve"> </w:t>
+            </w:r>
+            <w:proofErr w:type="spellStart"/>
+            <w:r>
+              <w:t>eas</w:t>
+            </w:r>
+            <w:proofErr w:type="spellEnd"/>
+            <w:r>
+              <w:t xml:space="preserve"> added to my existing code which solved the issues with the date format not being standardized properly</w:t>
+            </w:r>
+          </w:p>
+          <w:p/>
+          <w:p>
+            <w:proofErr w:type="gramStart"/>
+            <w:r>
+              <w:t>.rename</w:t>
+            </w:r>
+            <w:proofErr w:type="gramEnd"/>
+            <w:r>
+              <w:t>(columns</w:t>
+            </w:r>
+            <w:proofErr w:type="gramStart"/>
+            <w:r>
+              <w:t>={</w:t>
+            </w:r>
+            <w:proofErr w:type="gramEnd"/>
+            <w:r>
+              <w:t xml:space="preserve">}, </w:t>
+            </w:r>
+            <w:proofErr w:type="spellStart"/>
+            <w:r>
+              <w:t>inplace</w:t>
+            </w:r>
+            <w:proofErr w:type="spellEnd"/>
+            <w:r>
+              <w:t xml:space="preserve">=True) was output and utilized directly when renaming the new daily aggregate columns </w:t>
+            </w:r>
+          </w:p>
+        </w:tc>
+        <w:tc>
+          <w:tcPr>
+            <w:tcW w:w="4019" w:type="dxa"/>
+          </w:tcPr>
+          <w:p>
+            <w:r>
+              <w:t>No errors were given and a list of all tables were output along with the ‘</w:t>
+            </w:r>
+            <w:proofErr w:type="spellStart"/>
+            <w:r>
+              <w:t>weight_log</w:t>
+            </w:r>
+            <w:proofErr w:type="spellEnd"/>
+            <w:r>
+              <w:t xml:space="preserve">’ table I knew already existed. </w:t>
+            </w:r>
+          </w:p>
+          <w:p/>
+          <w:p/>
+          <w:p>
+            <w:r>
+              <w:t>N/A</w:t>
+            </w:r>
+          </w:p>
+          <w:p/>
+          <w:p/>
+          <w:p/>
+          <w:p>
+            <w:proofErr w:type="gramStart"/>
+            <w:r>
+              <w:t>Checking .head</w:t>
+            </w:r>
+            <w:proofErr w:type="gramEnd"/>
+            <w:r>
+              <w:t xml:space="preserve">() of the new </w:t>
+            </w:r>
+            <w:proofErr w:type="spellStart"/>
+            <w:r>
+              <w:t>dataframe</w:t>
+            </w:r>
+            <w:proofErr w:type="spellEnd"/>
+            <w:r>
+              <w:t xml:space="preserve"> to ensure the column was renamed properly</w:t>
+            </w:r>
+          </w:p>
+        </w:tc>
+      </w:tr>
+      <w:tr>
+        <w:trPr>
+          <w:trHeight w:val="1249"/>
+        </w:trPr>
+        <w:tc>
+          <w:tcPr>
+            <w:tcW w:w="1063" w:type="dxa"/>
+            <w:shd w:val="clear" w:color="auto" w:fill="E2EFD9" w:themeFill="accent6" w:themeFillTint="33"/>
+            <w:vAlign w:val="center"/>
+          </w:tcPr>
+          <w:p>
+            <w:pPr>
+              <w:jc w:val="center"/>
+            </w:pPr>
+            <w:r>
+              <w:t>16/03/26</w:t>
+            </w:r>
+          </w:p>
+        </w:tc>
+        <w:tc>
+          <w:tcPr>
+            <w:tcW w:w="909" w:type="dxa"/>
+            <w:vAlign w:val="center"/>
+          </w:tcPr>
+          <w:p>
+            <w:pPr>
+              <w:jc w:val="center"/>
+            </w:pPr>
+            <w:proofErr w:type="spellStart"/>
+            <w:r>
+              <w:t>claude</w:t>
+            </w:r>
+            <w:proofErr w:type="spellEnd"/>
+          </w:p>
+        </w:tc>
+        <w:tc>
+          <w:tcPr>
+            <w:tcW w:w="860" w:type="dxa"/>
+          </w:tcPr>
+          <w:p>
+            <w:r>
+              <w:t xml:space="preserve">- </w:t>
+            </w:r>
+            <w:r>
+              <w:rPr>
+                <w:color w:val="2F5496" w:themeColor="accent1" w:themeShade="BF"/>
+              </w:rPr>
+              <w:t>…</w:t>
+            </w:r>
+          </w:p>
+          <w:p>
+            <w:r>
+              <w:t xml:space="preserve">- </w:t>
+            </w:r>
+            <w:r>
+              <w:rPr>
+                <w:color w:val="2F5496" w:themeColor="accent1" w:themeShade="BF"/>
+              </w:rPr>
+              <w:t>…</w:t>
+            </w:r>
+          </w:p>
+          <w:p>
+            <w:r>
+              <w:t xml:space="preserve">- </w:t>
+            </w:r>
+            <w:r>
+              <w:rPr>
+                <w:color w:val="2F5496" w:themeColor="accent1" w:themeShade="BF"/>
+              </w:rPr>
+              <w:t>…</w:t>
+            </w:r>
+          </w:p>
+          <w:p>
+            <w:r>
+              <w:t xml:space="preserve">- </w:t>
+            </w:r>
+            <w:r>
+              <w:rPr>
+                <w:color w:val="2F5496" w:themeColor="accent1" w:themeShade="BF"/>
+              </w:rPr>
+              <w:t>…</w:t>
+            </w:r>
+          </w:p>
+        </w:tc>
+        <w:tc>
+          <w:tcPr>
+            <w:tcW w:w="1535" w:type="dxa"/>
+          </w:tcPr>
+          <w:p>
+            <w:r>
+              <w:t xml:space="preserve">how would </w:t>
+            </w:r>
+            <w:proofErr w:type="spellStart"/>
+            <w:r>
+              <w:t>i</w:t>
+            </w:r>
+            <w:proofErr w:type="spellEnd"/>
+            <w:r>
+              <w:t xml:space="preserve"> go about making a relationship plotter function where you input two statistics and the plot them against </w:t>
+            </w:r>
+            <w:proofErr w:type="spellStart"/>
+            <w:r>
+              <w:t>eachother</w:t>
+            </w:r>
+            <w:proofErr w:type="spellEnd"/>
+            <w:r>
+              <w:t xml:space="preserve">. for </w:t>
+            </w:r>
+            <w:proofErr w:type="gramStart"/>
+            <w:r>
+              <w:t>example</w:t>
+            </w:r>
+            <w:proofErr w:type="gramEnd"/>
+            <w:r>
+              <w:t xml:space="preserve"> you can put in sleep and calories and see how they correlate or maybe you could put in </w:t>
+            </w:r>
+            <w:proofErr w:type="spellStart"/>
+            <w:r>
+              <w:t>bmi</w:t>
+            </w:r>
+            <w:proofErr w:type="spellEnd"/>
+            <w:r>
+              <w:t xml:space="preserve"> and calories or </w:t>
+            </w:r>
+            <w:proofErr w:type="spellStart"/>
+            <w:r>
+              <w:t>bmi</w:t>
+            </w:r>
+            <w:proofErr w:type="spellEnd"/>
+            <w:r>
+              <w:t xml:space="preserve"> and sleep etc.</w:t>
+            </w:r>
+          </w:p>
+        </w:tc>
+        <w:tc>
+          <w:tcPr>
+            <w:tcW w:w="2153" w:type="dxa"/>
+          </w:tcPr>
+          <w:p>
+            <w:r>
+              <w:t xml:space="preserve">Claude provided the basic implementation method along with some code to go along with it. The method it suggested was to create a list of available statistics to choose from, use a scatter plot, verify the data is usable, and then make a simple plot with the </w:t>
+            </w:r>
+            <w:r>
+              <w:lastRenderedPageBreak/>
+              <w:t xml:space="preserve">selected data. I used </w:t>
+            </w:r>
+            <w:proofErr w:type="gramStart"/>
+            <w:r>
+              <w:t>it's</w:t>
+            </w:r>
+            <w:proofErr w:type="gramEnd"/>
+            <w:r>
+              <w:t xml:space="preserve"> code output along with support of basic documentation and lecture notes to make a simpler version of what it initially output. The trendline and best fit regression line is done using </w:t>
+            </w:r>
+            <w:proofErr w:type="spellStart"/>
+            <w:proofErr w:type="gramStart"/>
+            <w:r>
+              <w:t>np.polyfit</w:t>
+            </w:r>
+            <w:proofErr w:type="spellEnd"/>
+            <w:proofErr w:type="gramEnd"/>
+            <w:r>
+              <w:t xml:space="preserve"> as </w:t>
+            </w:r>
+            <w:proofErr w:type="spellStart"/>
+            <w:r>
+              <w:t>claudes</w:t>
+            </w:r>
+            <w:proofErr w:type="spellEnd"/>
+            <w:r>
+              <w:t xml:space="preserve"> output did. </w:t>
+            </w:r>
+          </w:p>
+        </w:tc>
+        <w:tc>
+          <w:tcPr>
+            <w:tcW w:w="4019" w:type="dxa"/>
+          </w:tcPr>
+          <w:p>
+            <w:r>
+              <w:lastRenderedPageBreak/>
+              <w:t xml:space="preserve">I check various parts of the output code that I was not familiar with using official documentation. That includes: </w:t>
+            </w:r>
+          </w:p>
+          <w:p>
+            <w:pPr>
+              <w:pStyle w:val="ListParagraph"/>
+              <w:numPr>
+                <w:ilvl w:val="0"/>
+                <w:numId w:val="4"/>
+              </w:numPr>
+              <w:rPr>
+                <w:color w:val="CC7BF4"/>
+              </w:rPr>
+            </w:pPr>
+            <w:r>
+              <w:rPr>
+                <w:rStyle w:val="token"/>
+                <w:color w:val="CC7BF4"/>
+              </w:rPr>
+              <w:t>raise</w:t>
+            </w:r>
+            <w:r>
+              <w:t xml:space="preserve"> </w:t>
+            </w:r>
+            <w:proofErr w:type="spellStart"/>
+            <w:proofErr w:type="gramStart"/>
+            <w:r>
+              <w:t>ValueError</w:t>
+            </w:r>
+            <w:proofErr w:type="spellEnd"/>
+            <w:r>
+              <w:t>(</w:t>
+            </w:r>
+            <w:proofErr w:type="gramEnd"/>
+            <w:r>
+              <w:t>)</w:t>
+            </w:r>
+          </w:p>
+          <w:p>
+            <w:pPr>
+              <w:pStyle w:val="ListParagraph"/>
+              <w:numPr>
+                <w:ilvl w:val="0"/>
+                <w:numId w:val="4"/>
+              </w:numPr>
+              <w:rPr>
+                <w:rStyle w:val="token"/>
+                <w:color w:val="CC7BF4"/>
+              </w:rPr>
+            </w:pPr>
+            <w:r>
+              <w:t xml:space="preserve">correlation </w:t>
+            </w:r>
+            <w:r>
+              <w:rPr>
+                <w:rStyle w:val="token"/>
+                <w:color w:val="EAECF0"/>
+              </w:rPr>
+              <w:t>=</w:t>
+            </w:r>
+            <w:r>
+              <w:t xml:space="preserve"> </w:t>
+            </w:r>
+            <w:proofErr w:type="spellStart"/>
+            <w:r>
+              <w:t>plot_df</w:t>
+            </w:r>
+            <w:proofErr w:type="spellEnd"/>
+            <w:r>
+              <w:rPr>
+                <w:rStyle w:val="token"/>
+                <w:color w:val="D3D7DE"/>
+              </w:rPr>
+              <w:t>[</w:t>
+            </w:r>
+            <w:proofErr w:type="spellStart"/>
+            <w:r>
+              <w:t>col_x</w:t>
+            </w:r>
+            <w:proofErr w:type="spellEnd"/>
+            <w:proofErr w:type="gramStart"/>
+            <w:r>
+              <w:rPr>
+                <w:rStyle w:val="token"/>
+                <w:color w:val="D3D7DE"/>
+              </w:rPr>
+              <w:t>].</w:t>
+            </w:r>
+            <w:proofErr w:type="spellStart"/>
+            <w:r>
+              <w:t>corr</w:t>
+            </w:r>
+            <w:proofErr w:type="spellEnd"/>
+            <w:proofErr w:type="gramEnd"/>
+            <w:r>
+              <w:rPr>
+                <w:rStyle w:val="token"/>
+                <w:color w:val="D3D7DE"/>
+              </w:rPr>
+              <w:t>(</w:t>
+            </w:r>
+            <w:proofErr w:type="spellStart"/>
+            <w:r>
+              <w:t>plot_df</w:t>
+            </w:r>
+            <w:proofErr w:type="spellEnd"/>
+            <w:r>
+              <w:rPr>
+                <w:rStyle w:val="token"/>
+                <w:color w:val="D3D7DE"/>
+              </w:rPr>
+              <w:t>[</w:t>
+            </w:r>
+            <w:proofErr w:type="spellStart"/>
+            <w:r>
+              <w:t>col_y</w:t>
+            </w:r>
+            <w:proofErr w:type="spellEnd"/>
+            <w:r>
+              <w:rPr>
+                <w:rStyle w:val="token"/>
+                <w:color w:val="D3D7DE"/>
+              </w:rPr>
+              <w:t>])</w:t>
+            </w:r>
+          </w:p>
+          <w:p>
+            <w:pPr>
+              <w:pStyle w:val="ListParagraph"/>
+              <w:numPr>
+                <w:ilvl w:val="0"/>
+                <w:numId w:val="4"/>
+              </w:numPr>
+              <w:rPr>
+                <w:rStyle w:val="token"/>
+                <w:color w:val="CC7BF4"/>
+              </w:rPr>
+            </w:pPr>
+            <w:r>
+              <w:t>alpha</w:t>
+            </w:r>
+            <w:r>
+              <w:rPr>
+                <w:rStyle w:val="token"/>
+                <w:color w:val="EAECF0"/>
+              </w:rPr>
+              <w:t>=</w:t>
+            </w:r>
+            <w:r>
+              <w:rPr>
+                <w:rStyle w:val="token"/>
+                <w:color w:val="5EEDED"/>
+              </w:rPr>
+              <w:t>0.5</w:t>
+            </w:r>
+            <w:r>
+              <w:rPr>
+                <w:rStyle w:val="token"/>
+                <w:color w:val="D3D7DE"/>
+              </w:rPr>
+              <w:t>,</w:t>
+            </w:r>
+            <w:r>
+              <w:t xml:space="preserve"> </w:t>
+            </w:r>
+            <w:proofErr w:type="spellStart"/>
+            <w:r>
+              <w:t>edgecolors</w:t>
+            </w:r>
+            <w:proofErr w:type="spellEnd"/>
+            <w:r>
+              <w:rPr>
+                <w:rStyle w:val="token"/>
+                <w:color w:val="EAECF0"/>
+              </w:rPr>
+              <w:t>=</w:t>
+            </w:r>
+            <w:r>
+              <w:rPr>
+                <w:rStyle w:val="token"/>
+                <w:color w:val="9BE963"/>
+              </w:rPr>
+              <w:t>'k'</w:t>
+            </w:r>
+          </w:p>
+          <w:p>
+            <w:pPr>
+              <w:rPr>
+                <w:color w:val="000000" w:themeColor="text1"/>
+              </w:rPr>
+            </w:pPr>
+            <w:r>
+              <w:rPr>
+                <w:color w:val="000000" w:themeColor="text1"/>
+              </w:rPr>
+              <w:t xml:space="preserve">I continued implementing my own code in combination with the code </w:t>
+            </w:r>
+            <w:proofErr w:type="spellStart"/>
+            <w:r>
+              <w:rPr>
+                <w:color w:val="000000" w:themeColor="text1"/>
+              </w:rPr>
+              <w:t>claude</w:t>
+            </w:r>
+            <w:proofErr w:type="spellEnd"/>
+            <w:r>
+              <w:rPr>
+                <w:color w:val="000000" w:themeColor="text1"/>
+              </w:rPr>
+              <w:t xml:space="preserve"> output until errors were resolved and the plots worked. I tested by hard coding the selected statistics to plot in the main body of my python script and then looped through all combinations of plots to </w:t>
+            </w:r>
+            <w:r>
+              <w:rPr>
+                <w:color w:val="000000" w:themeColor="text1"/>
+              </w:rPr>
+              <w:lastRenderedPageBreak/>
+              <w:t xml:space="preserve">ensure no bugs arose with a particular combination. </w:t>
+            </w:r>
+          </w:p>
+        </w:tc>
+      </w:tr>
+      <w:tr>
+        <w:trPr>
+          <w:trHeight w:val="1249"/>
+        </w:trPr>
+        <w:tc>
+          <w:tcPr>
+            <w:tcW w:w="1063" w:type="dxa"/>
+            <w:shd w:val="clear" w:color="auto" w:fill="E2EFD9" w:themeFill="accent6" w:themeFillTint="33"/>
+            <w:vAlign w:val="center"/>
+          </w:tcPr>
+          <w:p>
+            <w:pPr>
+              <w:jc w:val="center"/>
+              <w:rPr>
+                <w:color w:val="2F5496" w:themeColor="accent1" w:themeShade="BF"/>
+              </w:rPr>
+            </w:pPr>
+            <w:r>
+              <w:rPr>
+                <w:color w:val="2F5496" w:themeColor="accent1" w:themeShade="BF"/>
+              </w:rPr>
+              <w:lastRenderedPageBreak/>
+              <w:t>1</w:t>
+            </w:r>
+            <w:r>
+              <w:rPr>
+                <w:color w:val="2F5496" w:themeColor="accent1" w:themeShade="BF"/>
+              </w:rPr>
+              <w:t>7</w:t>
+            </w:r>
+            <w:r>
+              <w:rPr>
+                <w:color w:val="2F5496" w:themeColor="accent1" w:themeShade="BF"/>
+              </w:rPr>
+              <w:t>/03/26</w:t>
+            </w:r>
+          </w:p>
+        </w:tc>
+        <w:tc>
+          <w:tcPr>
+            <w:tcW w:w="909" w:type="dxa"/>
+            <w:vAlign w:val="center"/>
+          </w:tcPr>
+          <w:p>
+            <w:pPr>
+              <w:jc w:val="center"/>
+              <w:rPr>
+                <w:color w:val="2F5496" w:themeColor="accent1" w:themeShade="BF"/>
+              </w:rPr>
+            </w:pPr>
+            <w:proofErr w:type="spellStart"/>
+            <w:r>
+              <w:rPr>
+                <w:color w:val="2F5496" w:themeColor="accent1" w:themeShade="BF"/>
+              </w:rPr>
+              <w:t>claude</w:t>
+            </w:r>
+            <w:proofErr w:type="spellEnd"/>
+          </w:p>
+        </w:tc>
+        <w:tc>
+          <w:tcPr>
+            <w:tcW w:w="860" w:type="dxa"/>
+          </w:tcPr>
+          <w:p>
+            <w:r>
+              <w:t xml:space="preserve">- </w:t>
+            </w:r>
+            <w:r>
+              <w:rPr>
+                <w:color w:val="2F5496" w:themeColor="accent1" w:themeShade="BF"/>
+              </w:rPr>
+              <w:t>…</w:t>
+            </w:r>
+          </w:p>
+          <w:p>
+            <w:r>
+              <w:t xml:space="preserve">- </w:t>
+            </w:r>
+            <w:r>
+              <w:rPr>
+                <w:color w:val="2F5496" w:themeColor="accent1" w:themeShade="BF"/>
+              </w:rPr>
+              <w:t>…</w:t>
+            </w:r>
+          </w:p>
+          <w:p>
+            <w:r>
+              <w:t xml:space="preserve">- </w:t>
+            </w:r>
+            <w:r>
+              <w:rPr>
+                <w:color w:val="2F5496" w:themeColor="accent1" w:themeShade="BF"/>
+              </w:rPr>
+              <w:t>…</w:t>
+            </w:r>
+          </w:p>
+          <w:p>
+            <w:r>
+              <w:t xml:space="preserve">- </w:t>
+            </w:r>
+            <w:r>
+              <w:rPr>
+                <w:color w:val="2F5496" w:themeColor="accent1" w:themeShade="BF"/>
+              </w:rPr>
+              <w:t>…</w:t>
+            </w:r>
+          </w:p>
+        </w:tc>
+        <w:tc>
+          <w:tcPr>
+            <w:tcW w:w="1535" w:type="dxa"/>
+          </w:tcPr>
+          <w:p>
+            <w:r>
+              <w:t xml:space="preserve">Help generate tests in the main method for the helper functions provided. </w:t>
+            </w:r>
+          </w:p>
+        </w:tc>
+        <w:tc>
+          <w:tcPr>
+            <w:tcW w:w="2153" w:type="dxa"/>
+          </w:tcPr>
+          <w:p>
+            <w:r>
+              <w:t xml:space="preserve">Claude generated basic hard coded tests for the helper functions I wrote in part_4.py. I copied the tests directly and use them as provided since their only job was to run a quick sanity check on if my functions worked. They will get replaced when assembling the dashboard which is why using them directly is fine for a temporary solution. </w:t>
+            </w:r>
+          </w:p>
+        </w:tc>
+        <w:tc>
+          <w:tcPr>
+            <w:tcW w:w="4019" w:type="dxa"/>
+          </w:tcPr>
+          <w:p>
+            <w:r>
+              <w:t xml:space="preserve">They are straightforward and clear so a quick check to ensure </w:t>
+            </w:r>
+            <w:proofErr w:type="spellStart"/>
+            <w:r>
+              <w:t>theyre</w:t>
+            </w:r>
+            <w:proofErr w:type="spellEnd"/>
+            <w:r>
+              <w:t xml:space="preserve"> testing the correct things was all I needed to do. </w:t>
+            </w:r>
+          </w:p>
+        </w:tc>
+      </w:tr>
+      <w:tr>
+        <w:trPr>
+          <w:trHeight w:val="1249"/>
+        </w:trPr>
+        <w:tc>
+          <w:tcPr>
+            <w:tcW w:w="1063" w:type="dxa"/>
+            <w:shd w:val="clear" w:color="auto" w:fill="E2EFD9" w:themeFill="accent6" w:themeFillTint="33"/>
+            <w:vAlign w:val="center"/>
+          </w:tcPr>
+          <w:p>
+            <w:pPr>
+              <w:jc w:val="center"/>
+              <w:rPr>
+                <w:color w:val="2F5496" w:themeColor="accent1" w:themeShade="BF"/>
+              </w:rPr>
+            </w:pPr>
+            <w:r>
+              <w:rPr>
+                <w:color w:val="2F5496" w:themeColor="accent1" w:themeShade="BF"/>
+              </w:rPr>
+              <w:t>17/03/26</w:t>
+            </w:r>
+          </w:p>
+        </w:tc>
+        <w:tc>
+          <w:tcPr>
+            <w:tcW w:w="909" w:type="dxa"/>
+            <w:vAlign w:val="center"/>
+          </w:tcPr>
+          <w:p>
+            <w:pPr>
+              <w:jc w:val="center"/>
+              <w:rPr>
+                <w:color w:val="2F5496" w:themeColor="accent1" w:themeShade="BF"/>
+              </w:rPr>
+            </w:pPr>
+            <w:proofErr w:type="spellStart"/>
+            <w:r>
+              <w:rPr>
+                <w:color w:val="2F5496" w:themeColor="accent1" w:themeShade="BF"/>
+              </w:rPr>
+              <w:t>claude</w:t>
+            </w:r>
+            <w:proofErr w:type="spellEnd"/>
+          </w:p>
+        </w:tc>
+        <w:tc>
+          <w:tcPr>
+            <w:tcW w:w="860" w:type="dxa"/>
+          </w:tcPr>
+          <w:p/>
+        </w:tc>
+        <w:tc>
+          <w:tcPr>
+            <w:tcW w:w="1535" w:type="dxa"/>
+          </w:tcPr>
+          <w:p>
+            <w:r>
+              <w:t xml:space="preserve">this current code aims to </w:t>
+            </w:r>
+            <w:proofErr w:type="spellStart"/>
+            <w:r>
+              <w:t>creata</w:t>
+            </w:r>
+            <w:proofErr w:type="spellEnd"/>
+            <w:r>
+              <w:t xml:space="preserve"> a sidebar with a dropdown selection menu of ID's and then when the user selects the ID and confirms with form submit button it should just provide the summary statistics output but the </w:t>
+            </w:r>
+            <w:proofErr w:type="spellStart"/>
+            <w:r>
+              <w:t>get_individual_summary</w:t>
+            </w:r>
+            <w:proofErr w:type="spellEnd"/>
+            <w:r>
+              <w:t xml:space="preserve"> helper function. How do I tweak my code to properly fix the </w:t>
+            </w:r>
+            <w:proofErr w:type="spellStart"/>
+            <w:r>
+              <w:t>form_submit_button</w:t>
+            </w:r>
+            <w:proofErr w:type="spellEnd"/>
+            <w:r>
+              <w:t xml:space="preserve"> errors and </w:t>
+            </w:r>
+            <w:proofErr w:type="spellStart"/>
+            <w:r>
+              <w:t>acomplish</w:t>
+            </w:r>
+            <w:proofErr w:type="spellEnd"/>
+            <w:r>
+              <w:t xml:space="preserve"> my goal. Here is the code I have below:</w:t>
+            </w:r>
+            <w:r>
+              <w:t xml:space="preserve"> </w:t>
+            </w:r>
+          </w:p>
+          <w:p>
+            <w:proofErr w:type="spellStart"/>
+            <w:r>
+              <w:t>df</w:t>
+            </w:r>
+            <w:proofErr w:type="spellEnd"/>
+            <w:r>
+              <w:t xml:space="preserve"> = </w:t>
+            </w:r>
+            <w:proofErr w:type="spellStart"/>
+            <w:r>
+              <w:t>load_</w:t>
+            </w:r>
+            <w:proofErr w:type="gramStart"/>
+            <w:r>
+              <w:t>data</w:t>
+            </w:r>
+            <w:proofErr w:type="spellEnd"/>
+            <w:r>
+              <w:t>(</w:t>
+            </w:r>
+            <w:proofErr w:type="gramEnd"/>
+            <w:r>
+              <w:t>)</w:t>
+            </w:r>
+          </w:p>
+          <w:p/>
+          <w:p>
+            <w:r>
+              <w:t># ID selector sidebar</w:t>
+            </w:r>
+          </w:p>
+          <w:p>
+            <w:r>
+              <w:t xml:space="preserve">with </w:t>
+            </w:r>
+            <w:proofErr w:type="spellStart"/>
+            <w:proofErr w:type="gramStart"/>
+            <w:r>
+              <w:t>st.sidebar</w:t>
+            </w:r>
+            <w:proofErr w:type="spellEnd"/>
+            <w:proofErr w:type="gramEnd"/>
+            <w:r>
+              <w:t xml:space="preserve">: </w:t>
+            </w:r>
+          </w:p>
+          <w:p>
+            <w:r>
+              <w:t xml:space="preserve">    </w:t>
+            </w:r>
+            <w:proofErr w:type="spellStart"/>
+            <w:proofErr w:type="gramStart"/>
+            <w:r>
+              <w:t>st.header</w:t>
+            </w:r>
+            <w:proofErr w:type="spellEnd"/>
+            <w:proofErr w:type="gramEnd"/>
+            <w:r>
+              <w:t>("ID Selector")</w:t>
+            </w:r>
+          </w:p>
+          <w:p>
+            <w:r>
+              <w:t xml:space="preserve">    </w:t>
+            </w:r>
+            <w:proofErr w:type="spellStart"/>
+            <w:r>
+              <w:t>selected_id</w:t>
+            </w:r>
+            <w:proofErr w:type="spellEnd"/>
+            <w:r>
+              <w:t xml:space="preserve"> = </w:t>
+            </w:r>
+            <w:proofErr w:type="spellStart"/>
+            <w:proofErr w:type="gramStart"/>
+            <w:r>
+              <w:t>st.selectbox</w:t>
+            </w:r>
+            <w:proofErr w:type="spellEnd"/>
+            <w:proofErr w:type="gramEnd"/>
+            <w:r>
+              <w:t>("Select user ID", ID_LIST)</w:t>
+            </w:r>
+          </w:p>
+          <w:p>
+            <w:r>
+              <w:t xml:space="preserve">    submitted = </w:t>
+            </w:r>
+            <w:proofErr w:type="spellStart"/>
+            <w:proofErr w:type="gramStart"/>
+            <w:r>
+              <w:t>st.form</w:t>
+            </w:r>
+            <w:proofErr w:type="gramEnd"/>
+            <w:r>
+              <w:t>_submit_</w:t>
+            </w:r>
+            <w:proofErr w:type="gramStart"/>
+            <w:r>
+              <w:t>button</w:t>
+            </w:r>
+            <w:proofErr w:type="spellEnd"/>
+            <w:r>
+              <w:t>(</w:t>
+            </w:r>
+            <w:proofErr w:type="gramEnd"/>
+            <w:r>
+              <w:t>"</w:t>
+            </w:r>
+            <w:proofErr w:type="spellStart"/>
+            <w:r>
+              <w:t>Analyze</w:t>
+            </w:r>
+            <w:proofErr w:type="spellEnd"/>
+            <w:r>
+              <w:t xml:space="preserve"> User")</w:t>
+            </w:r>
+          </w:p>
+          <w:p>
+            <w:r>
+              <w:t xml:space="preserve">if submitted: </w:t>
+            </w:r>
+          </w:p>
+          <w:p>
+            <w:r>
+              <w:lastRenderedPageBreak/>
+              <w:t xml:space="preserve">    user = </w:t>
+            </w:r>
+            <w:proofErr w:type="spellStart"/>
+            <w:r>
+              <w:t>df</w:t>
+            </w:r>
+            <w:proofErr w:type="spellEnd"/>
+            <w:r>
+              <w:t>[</w:t>
+            </w:r>
+            <w:proofErr w:type="spellStart"/>
+            <w:r>
+              <w:t>df</w:t>
+            </w:r>
+            <w:proofErr w:type="spellEnd"/>
+            <w:r>
+              <w:t xml:space="preserve">["Id"] == </w:t>
+            </w:r>
+            <w:proofErr w:type="spellStart"/>
+            <w:r>
+              <w:t>selected_id</w:t>
+            </w:r>
+            <w:proofErr w:type="spellEnd"/>
+            <w:r>
+              <w:t>]</w:t>
+            </w:r>
+          </w:p>
+          <w:p>
+            <w:r>
+              <w:t xml:space="preserve">    </w:t>
+            </w:r>
+            <w:proofErr w:type="spellStart"/>
+            <w:proofErr w:type="gramStart"/>
+            <w:r>
+              <w:t>st.write</w:t>
+            </w:r>
+            <w:proofErr w:type="spellEnd"/>
+            <w:proofErr w:type="gramEnd"/>
+            <w:r>
+              <w:t>(user)</w:t>
+            </w:r>
+          </w:p>
+          <w:p/>
+          <w:p/>
+        </w:tc>
+        <w:tc>
+          <w:tcPr>
+            <w:tcW w:w="2153" w:type="dxa"/>
+          </w:tcPr>
+          <w:p>
+            <w:r>
+              <w:lastRenderedPageBreak/>
+              <w:t xml:space="preserve">Direct implementation. </w:t>
+            </w:r>
+            <w:proofErr w:type="gramStart"/>
+            <w:r>
+              <w:t>Claudes</w:t>
+            </w:r>
+            <w:proofErr w:type="gramEnd"/>
+            <w:r>
+              <w:t xml:space="preserve"> code provided the accurate syntax that involved wrapping the </w:t>
+            </w:r>
+            <w:proofErr w:type="spellStart"/>
+            <w:r>
+              <w:t>selecition</w:t>
+            </w:r>
+            <w:proofErr w:type="spellEnd"/>
+            <w:r>
+              <w:t xml:space="preserve"> menu in a form box to use the form submit button properly. </w:t>
+            </w:r>
+          </w:p>
+        </w:tc>
+        <w:tc>
+          <w:tcPr>
+            <w:tcW w:w="4019" w:type="dxa"/>
+          </w:tcPr>
+          <w:p>
+            <w:r>
+              <w:t xml:space="preserve">Running </w:t>
+            </w:r>
+            <w:proofErr w:type="spellStart"/>
+            <w:r>
+              <w:t>streamlit</w:t>
+            </w:r>
+            <w:proofErr w:type="spellEnd"/>
+            <w:r>
+              <w:t xml:space="preserve"> run dashboard.py and testing the new widget until it worked properly. </w:t>
             </w:r>
           </w:p>
         </w:tc>
@@ -4155,7 +5661,6 @@
         <w:rPr>
           <w:color w:val="000000" w:themeColor="text1"/>
         </w:rPr>
-        <w:lastRenderedPageBreak/>
         <w:t xml:space="preserve">It supported since I did not use </w:t>
       </w:r>
       <w:proofErr w:type="spellStart"/>
@@ -4686,6 +6191,118 @@
     </w:lvl>
   </w:abstractNum>
   <w:abstractNum w:abstractNumId="2" w15:restartNumberingAfterBreak="0">
+    <w:nsid w:val="52D0456A"/>
+    <w:multiLevelType w:val="hybridMultilevel"/>
+    <w:tmpl w:val="A672EA86"/>
+    <w:lvl w:ilvl="0" w:tplc="0D106762">
+      <w:numFmt w:val="bullet"/>
+      <w:lvlText w:val="-"/>
+      <w:lvlJc w:val="left"/>
+      <w:pPr>
+        <w:ind w:left="720" w:hanging="360"/>
+      </w:pPr>
+      <w:rPr>
+        <w:rFonts w:ascii="Calibri" w:eastAsiaTheme="minorHAnsi" w:hAnsi="Calibri" w:cs="Calibri" w:hint="default"/>
+      </w:rPr>
+    </w:lvl>
+    <w:lvl w:ilvl="1" w:tplc="04090003" w:tentative="1">
+      <w:start w:val="1"/>
+      <w:numFmt w:val="bullet"/>
+      <w:lvlText w:val="o"/>
+      <w:lvlJc w:val="left"/>
+      <w:pPr>
+        <w:ind w:left="1440" w:hanging="360"/>
+      </w:pPr>
+      <w:rPr>
+        <w:rFonts w:ascii="Courier New" w:hAnsi="Courier New" w:cs="Courier New" w:hint="default"/>
+      </w:rPr>
+    </w:lvl>
+    <w:lvl w:ilvl="2" w:tplc="04090005" w:tentative="1">
+      <w:start w:val="1"/>
+      <w:numFmt w:val="bullet"/>
+      <w:lvlText w:val=""/>
+      <w:lvlJc w:val="left"/>
+      <w:pPr>
+        <w:ind w:left="2160" w:hanging="360"/>
+      </w:pPr>
+      <w:rPr>
+        <w:rFonts w:ascii="Wingdings" w:hAnsi="Wingdings" w:hint="default"/>
+      </w:rPr>
+    </w:lvl>
+    <w:lvl w:ilvl="3" w:tplc="04090001" w:tentative="1">
+      <w:start w:val="1"/>
+      <w:numFmt w:val="bullet"/>
+      <w:lvlText w:val=""/>
+      <w:lvlJc w:val="left"/>
+      <w:pPr>
+        <w:ind w:left="2880" w:hanging="360"/>
+      </w:pPr>
+      <w:rPr>
+        <w:rFonts w:ascii="Symbol" w:hAnsi="Symbol" w:hint="default"/>
+      </w:rPr>
+    </w:lvl>
+    <w:lvl w:ilvl="4" w:tplc="04090003" w:tentative="1">
+      <w:start w:val="1"/>
+      <w:numFmt w:val="bullet"/>
+      <w:lvlText w:val="o"/>
+      <w:lvlJc w:val="left"/>
+      <w:pPr>
+        <w:ind w:left="3600" w:hanging="360"/>
+      </w:pPr>
+      <w:rPr>
+        <w:rFonts w:ascii="Courier New" w:hAnsi="Courier New" w:cs="Courier New" w:hint="default"/>
+      </w:rPr>
+    </w:lvl>
+    <w:lvl w:ilvl="5" w:tplc="04090005" w:tentative="1">
+      <w:start w:val="1"/>
+      <w:numFmt w:val="bullet"/>
+      <w:lvlText w:val=""/>
+      <w:lvlJc w:val="left"/>
+      <w:pPr>
+        <w:ind w:left="4320" w:hanging="360"/>
+      </w:pPr>
+      <w:rPr>
+        <w:rFonts w:ascii="Wingdings" w:hAnsi="Wingdings" w:hint="default"/>
+      </w:rPr>
+    </w:lvl>
+    <w:lvl w:ilvl="6" w:tplc="04090001" w:tentative="1">
+      <w:start w:val="1"/>
+      <w:numFmt w:val="bullet"/>
+      <w:lvlText w:val=""/>
+      <w:lvlJc w:val="left"/>
+      <w:pPr>
+        <w:ind w:left="5040" w:hanging="360"/>
+      </w:pPr>
+      <w:rPr>
+        <w:rFonts w:ascii="Symbol" w:hAnsi="Symbol" w:hint="default"/>
+      </w:rPr>
+    </w:lvl>
+    <w:lvl w:ilvl="7" w:tplc="04090003" w:tentative="1">
+      <w:start w:val="1"/>
+      <w:numFmt w:val="bullet"/>
+      <w:lvlText w:val="o"/>
+      <w:lvlJc w:val="left"/>
+      <w:pPr>
+        <w:ind w:left="5760" w:hanging="360"/>
+      </w:pPr>
+      <w:rPr>
+        <w:rFonts w:ascii="Courier New" w:hAnsi="Courier New" w:cs="Courier New" w:hint="default"/>
+      </w:rPr>
+    </w:lvl>
+    <w:lvl w:ilvl="8" w:tplc="04090005" w:tentative="1">
+      <w:start w:val="1"/>
+      <w:numFmt w:val="bullet"/>
+      <w:lvlText w:val=""/>
+      <w:lvlJc w:val="left"/>
+      <w:pPr>
+        <w:ind w:left="6480" w:hanging="360"/>
+      </w:pPr>
+      <w:rPr>
+        <w:rFonts w:ascii="Wingdings" w:hAnsi="Wingdings" w:hint="default"/>
+      </w:rPr>
+    </w:lvl>
+  </w:abstractNum>
+  <w:abstractNum w:abstractNumId="3" w15:restartNumberingAfterBreak="0">
     <w:nsid w:val="674C1B29"/>
     <w:multiLevelType w:val="hybridMultilevel"/>
     <w:tmpl w:val="7166F936"/>
@@ -4804,6 +6421,9 @@
     <w:abstractNumId w:val="1"/>
   </w:num>
   <w:num w:numId="3" w16cid:durableId="1503812029">
+    <w:abstractNumId w:val="3"/>
+  </w:num>
+  <w:num w:numId="4" w16cid:durableId="1213418233">
     <w:abstractNumId w:val="2"/>
   </w:num>
 </w:numbering>
@@ -5334,6 +6954,11 @@
       <w:contextualSpacing/>
     </w:pPr>
   </w:style>
+  <w:style w:type="character" w:customStyle="1" w:styleId="token">
+    <w:name w:val="token"/>
+    <w:basedOn w:val="DefaultParagraphFont"/>
+    <w:rsid w:val="00715F95"/>
+  </w:style>
 </w:styles>
 </file>
 

</xml_diff>

<commit_message>
added to AI form
</commit_message>
<xml_diff>
--- a/AI_evaluation.docx
+++ b/AI_evaluation.docx
@@ -178,7 +178,7 @@
           </w:tcPr>
           <w:p>
             <w:r>
-              <w:t>6</w:t>
+              <w:t>8</w:t>
             </w:r>
           </w:p>
         </w:tc>
@@ -199,10 +199,7 @@
               <w:t xml:space="preserve">- </w:t>
             </w:r>
             <w:r>
-              <w:rPr>
-                <w:color w:val="2F5496" w:themeColor="accent1" w:themeShade="BF"/>
-              </w:rPr>
-              <w:t>…</w:t>
+              <w:t>edits to dashboard (part 5)</w:t>
             </w:r>
           </w:p>
           <w:p>
@@ -3203,6 +3200,13 @@
                 <w:color w:val="000000" w:themeColor="text1"/>
               </w:rPr>
             </w:pPr>
+            <w:r>
+              <w:rPr>
+                <w:color w:val="000000" w:themeColor="text1"/>
+              </w:rPr>
+              <w:lastRenderedPageBreak/>
+              <w:t>3/22</w:t>
+            </w:r>
           </w:p>
         </w:tc>
         <w:tc>
@@ -3216,6 +3220,12 @@
                 <w:color w:val="000000" w:themeColor="text1"/>
               </w:rPr>
             </w:pPr>
+            <w:r>
+              <w:rPr>
+                <w:color w:val="000000" w:themeColor="text1"/>
+              </w:rPr>
+              <w:t>ChatGPT</w:t>
+            </w:r>
           </w:p>
         </w:tc>
         <w:tc>
@@ -3229,6 +3239,26 @@
                 <w:color w:val="000000" w:themeColor="text1"/>
               </w:rPr>
             </w:pPr>
+            <w:r>
+              <w:rPr>
+                <w:color w:val="000000" w:themeColor="text1"/>
+              </w:rPr>
+              <w:t xml:space="preserve">Creating </w:t>
+            </w:r>
+            <w:proofErr w:type="spellStart"/>
+            <w:r>
+              <w:rPr>
+                <w:color w:val="000000" w:themeColor="text1"/>
+              </w:rPr>
+              <w:t>color</w:t>
+            </w:r>
+            <w:proofErr w:type="spellEnd"/>
+            <w:r>
+              <w:rPr>
+                <w:color w:val="000000" w:themeColor="text1"/>
+              </w:rPr>
+              <w:t xml:space="preserve"> scheme</w:t>
+            </w:r>
           </w:p>
         </w:tc>
         <w:tc>
@@ -3242,6 +3272,40 @@
                 <w:color w:val="000000" w:themeColor="text1"/>
               </w:rPr>
             </w:pPr>
+            <w:r>
+              <w:rPr>
+                <w:color w:val="000000" w:themeColor="text1"/>
+              </w:rPr>
+              <w:t xml:space="preserve">How do I make my </w:t>
+            </w:r>
+            <w:proofErr w:type="spellStart"/>
+            <w:r>
+              <w:rPr>
+                <w:color w:val="000000" w:themeColor="text1"/>
+              </w:rPr>
+              <w:t>streamlit</w:t>
+            </w:r>
+            <w:proofErr w:type="spellEnd"/>
+            <w:r>
+              <w:rPr>
+                <w:color w:val="000000" w:themeColor="text1"/>
+              </w:rPr>
+              <w:t xml:space="preserve"> dashboard more visually appealing with a </w:t>
+            </w:r>
+            <w:proofErr w:type="spellStart"/>
+            <w:r>
+              <w:rPr>
+                <w:color w:val="000000" w:themeColor="text1"/>
+              </w:rPr>
+              <w:t>color</w:t>
+            </w:r>
+            <w:proofErr w:type="spellEnd"/>
+            <w:r>
+              <w:rPr>
+                <w:color w:val="000000" w:themeColor="text1"/>
+              </w:rPr>
+              <w:t xml:space="preserve"> scheme</w:t>
+            </w:r>
           </w:p>
         </w:tc>
         <w:tc>
@@ -3254,6 +3318,12 @@
                 <w:color w:val="000000" w:themeColor="text1"/>
               </w:rPr>
             </w:pPr>
+            <w:r>
+              <w:rPr>
+                <w:color w:val="000000" w:themeColor="text1"/>
+              </w:rPr>
+              <w:t>inspiration</w:t>
+            </w:r>
           </w:p>
         </w:tc>
         <w:tc>
@@ -3266,6 +3336,26 @@
                 <w:color w:val="000000" w:themeColor="text1"/>
               </w:rPr>
             </w:pPr>
+            <w:r>
+              <w:rPr>
+                <w:color w:val="000000" w:themeColor="text1"/>
+              </w:rPr>
+              <w:t xml:space="preserve">Ran dashboard to see that </w:t>
+            </w:r>
+            <w:proofErr w:type="spellStart"/>
+            <w:r>
+              <w:rPr>
+                <w:color w:val="000000" w:themeColor="text1"/>
+              </w:rPr>
+              <w:t>color</w:t>
+            </w:r>
+            <w:proofErr w:type="spellEnd"/>
+            <w:r>
+              <w:rPr>
+                <w:color w:val="000000" w:themeColor="text1"/>
+              </w:rPr>
+              <w:t xml:space="preserve"> plot worked</w:t>
+            </w:r>
           </w:p>
         </w:tc>
       </w:tr>
@@ -3280,6 +3370,12 @@
                 <w:color w:val="000000" w:themeColor="text1"/>
               </w:rPr>
             </w:pPr>
+            <w:r>
+              <w:rPr>
+                <w:color w:val="000000" w:themeColor="text1"/>
+              </w:rPr>
+              <w:t>3/22</w:t>
+            </w:r>
           </w:p>
         </w:tc>
         <w:tc>
@@ -3293,6 +3389,12 @@
                 <w:color w:val="000000" w:themeColor="text1"/>
               </w:rPr>
             </w:pPr>
+            <w:r>
+              <w:rPr>
+                <w:color w:val="000000" w:themeColor="text1"/>
+              </w:rPr>
+              <w:t>ChatGPT</w:t>
+            </w:r>
           </w:p>
         </w:tc>
         <w:tc>
@@ -3306,6 +3408,18 @@
                 <w:color w:val="000000" w:themeColor="text1"/>
               </w:rPr>
             </w:pPr>
+            <w:r>
+              <w:rPr>
+                <w:color w:val="000000" w:themeColor="text1"/>
+              </w:rPr>
+              <w:t xml:space="preserve">How to upload </w:t>
+            </w:r>
+            <w:r>
+              <w:rPr>
+                <w:color w:val="000000" w:themeColor="text1"/>
+              </w:rPr>
+              <w:t>workouts by days of week plot to dashboard</w:t>
+            </w:r>
           </w:p>
         </w:tc>
         <w:tc>
@@ -3319,6 +3433,26 @@
                 <w:color w:val="000000" w:themeColor="text1"/>
               </w:rPr>
             </w:pPr>
+            <w:r>
+              <w:rPr>
+                <w:color w:val="000000" w:themeColor="text1"/>
+              </w:rPr>
+              <w:t xml:space="preserve">Given this plot (insert code from part 1), how do I upload to this </w:t>
+            </w:r>
+            <w:proofErr w:type="spellStart"/>
+            <w:r>
+              <w:rPr>
+                <w:color w:val="000000" w:themeColor="text1"/>
+              </w:rPr>
+              <w:t>streamlit</w:t>
+            </w:r>
+            <w:proofErr w:type="spellEnd"/>
+            <w:r>
+              <w:rPr>
+                <w:color w:val="000000" w:themeColor="text1"/>
+              </w:rPr>
+              <w:t xml:space="preserve"> dashboard (insert dashboard code)</w:t>
+            </w:r>
           </w:p>
         </w:tc>
         <w:tc>
@@ -3331,6 +3465,12 @@
                 <w:color w:val="000000" w:themeColor="text1"/>
               </w:rPr>
             </w:pPr>
+            <w:r>
+              <w:rPr>
+                <w:color w:val="000000" w:themeColor="text1"/>
+              </w:rPr>
+              <w:t>directly</w:t>
+            </w:r>
           </w:p>
         </w:tc>
         <w:tc>
@@ -3343,6 +3483,12 @@
                 <w:color w:val="000000" w:themeColor="text1"/>
               </w:rPr>
             </w:pPr>
+            <w:r>
+              <w:rPr>
+                <w:color w:val="000000" w:themeColor="text1"/>
+              </w:rPr>
+              <w:t>Ran dashboard to make sure plot appeared as intended</w:t>
+            </w:r>
           </w:p>
         </w:tc>
       </w:tr>
@@ -3357,6 +3503,12 @@
                 <w:color w:val="000000" w:themeColor="text1"/>
               </w:rPr>
             </w:pPr>
+            <w:r>
+              <w:rPr>
+                <w:color w:val="000000" w:themeColor="text1"/>
+              </w:rPr>
+              <w:t>3/22</w:t>
+            </w:r>
           </w:p>
         </w:tc>
         <w:tc>
@@ -3370,6 +3522,12 @@
                 <w:color w:val="000000" w:themeColor="text1"/>
               </w:rPr>
             </w:pPr>
+            <w:r>
+              <w:rPr>
+                <w:color w:val="000000" w:themeColor="text1"/>
+              </w:rPr>
+              <w:t>ChatGPT</w:t>
+            </w:r>
           </w:p>
         </w:tc>
         <w:tc>
@@ -3383,6 +3541,18 @@
                 <w:color w:val="000000" w:themeColor="text1"/>
               </w:rPr>
             </w:pPr>
+            <w:r>
+              <w:rPr>
+                <w:color w:val="000000" w:themeColor="text1"/>
+              </w:rPr>
+              <w:t>Dropped sleep values equal to 0</w:t>
+            </w:r>
+            <w:r>
+              <w:rPr>
+                <w:color w:val="000000" w:themeColor="text1"/>
+              </w:rPr>
+              <w:t>, and reflected changes in plots</w:t>
+            </w:r>
           </w:p>
         </w:tc>
         <w:tc>
@@ -3396,6 +3566,18 @@
                 <w:color w:val="000000" w:themeColor="text1"/>
               </w:rPr>
             </w:pPr>
+            <w:r>
+              <w:rPr>
+                <w:color w:val="000000" w:themeColor="text1"/>
+              </w:rPr>
+              <w:t>Given this dashboard (insert dashboard code)</w:t>
+            </w:r>
+            <w:r>
+              <w:rPr>
+                <w:color w:val="000000" w:themeColor="text1"/>
+              </w:rPr>
+              <w:t>, make edits so that values where sleep = 0 are dropped and this is reflected in the overview and sleep analysis sections</w:t>
+            </w:r>
           </w:p>
         </w:tc>
         <w:tc>
@@ -3408,6 +3590,12 @@
                 <w:color w:val="000000" w:themeColor="text1"/>
               </w:rPr>
             </w:pPr>
+            <w:r>
+              <w:rPr>
+                <w:color w:val="000000" w:themeColor="text1"/>
+              </w:rPr>
+              <w:t>directly</w:t>
+            </w:r>
           </w:p>
         </w:tc>
         <w:tc>
@@ -3420,6 +3608,12 @@
                 <w:color w:val="000000" w:themeColor="text1"/>
               </w:rPr>
             </w:pPr>
+            <w:r>
+              <w:rPr>
+                <w:color w:val="000000" w:themeColor="text1"/>
+              </w:rPr>
+              <w:t xml:space="preserve">Checked that plots accurately reflected change, summary statistics were updated. </w:t>
+            </w:r>
           </w:p>
         </w:tc>
       </w:tr>
@@ -3766,6 +3960,7 @@
               <w:rPr>
                 <w:color w:val="2F5496" w:themeColor="accent1" w:themeShade="BF"/>
               </w:rPr>
+              <w:lastRenderedPageBreak/>
               <w:t>21-03-2026</w:t>
             </w:r>
           </w:p>
@@ -4359,19 +4554,7 @@
               <w:rPr>
                 <w:color w:val="2F5496" w:themeColor="accent1" w:themeShade="BF"/>
               </w:rPr>
-              <w:t>1</w:t>
-            </w:r>
-            <w:r>
-              <w:rPr>
-                <w:color w:val="2F5496" w:themeColor="accent1" w:themeShade="BF"/>
-              </w:rPr>
-              <w:t>5</w:t>
-            </w:r>
-            <w:r>
-              <w:rPr>
-                <w:color w:val="2F5496" w:themeColor="accent1" w:themeShade="BF"/>
-              </w:rPr>
-              <w:t>/03/26</w:t>
+              <w:t>15/03/26</w:t>
             </w:r>
           </w:p>
         </w:tc>
@@ -4663,7 +4846,11 @@
             </w:r>
             <w:proofErr w:type="spellEnd"/>
             <w:r>
-              <w:t xml:space="preserve"> added to my existing code which solved the issues with the date format not being standardized properly</w:t>
+              <w:t xml:space="preserve"> added to my existing code which solved the issues with the date format not </w:t>
+            </w:r>
+            <w:r>
+              <w:lastRenderedPageBreak/>
+              <w:t>being standardized properly</w:t>
             </w:r>
           </w:p>
           <w:p/>
@@ -4700,6 +4887,7 @@
           </w:tcPr>
           <w:p>
             <w:r>
+              <w:lastRenderedPageBreak/>
               <w:t>No errors were given and a list of all tables were output along with the ‘</w:t>
             </w:r>
             <w:proofErr w:type="spellStart"/>
@@ -4881,11 +5069,7 @@
           </w:tcPr>
           <w:p>
             <w:r>
-              <w:t xml:space="preserve">Claude provided the basic implementation method along with some code to go along with it. The method it suggested was to create a list of available statistics to choose from, use a scatter plot, verify the data is usable, and then make a simple plot with the </w:t>
-            </w:r>
-            <w:r>
-              <w:lastRenderedPageBreak/>
-              <w:t xml:space="preserve">selected data. I used </w:t>
+              <w:t xml:space="preserve">Claude provided the basic implementation method along with some code to go along with it. The method it suggested was to create a list of available statistics to choose from, use a scatter plot, verify the data is usable, and then make a simple plot with the selected data. I used </w:t>
             </w:r>
             <w:proofErr w:type="gramStart"/>
             <w:r>
@@ -4921,7 +5105,6 @@
           </w:tcPr>
           <w:p>
             <w:r>
-              <w:lastRenderedPageBreak/>
               <w:t xml:space="preserve">I check various parts of the output code that I was not familiar with using official documentation. That includes: </w:t>
             </w:r>
           </w:p>
@@ -5131,14 +5314,7 @@
               <w:rPr>
                 <w:color w:val="000000" w:themeColor="text1"/>
               </w:rPr>
-              <w:t xml:space="preserve"> output until errors were resolved and the plots worked. I tested by hard coding the selected statistics to plot in the main body of my python script and then looped through all combinations of plots to </w:t>
-            </w:r>
-            <w:r>
-              <w:rPr>
-                <w:color w:val="000000" w:themeColor="text1"/>
-              </w:rPr>
-              <w:lastRenderedPageBreak/>
-              <w:t xml:space="preserve">ensure no bugs arose with a particular combination. </w:t>
+              <w:t xml:space="preserve"> output until errors were resolved and the plots worked. I tested by hard coding the selected statistics to plot in the main body of my python script and then looped through all combinations of plots to ensure no bugs arose with a particular combination. </w:t>
             </w:r>
           </w:p>
         </w:tc>
@@ -5164,20 +5340,7 @@
               <w:rPr>
                 <w:color w:val="2F5496" w:themeColor="accent1" w:themeShade="BF"/>
               </w:rPr>
-              <w:lastRenderedPageBreak/>
-              <w:t>1</w:t>
-            </w:r>
-            <w:r>
-              <w:rPr>
-                <w:color w:val="2F5496" w:themeColor="accent1" w:themeShade="BF"/>
-              </w:rPr>
-              <w:t>7</w:t>
-            </w:r>
-            <w:r>
-              <w:rPr>
-                <w:color w:val="2F5496" w:themeColor="accent1" w:themeShade="BF"/>
-              </w:rPr>
-              <w:t>/03/26</w:t>
+              <w:t>17/03/26</w:t>
             </w:r>
           </w:p>
         </w:tc>
@@ -5312,6 +5475,7 @@
               <w:rPr>
                 <w:color w:val="2F5496" w:themeColor="accent1" w:themeShade="BF"/>
               </w:rPr>
+              <w:lastRenderedPageBreak/>
               <w:t>17/03/26</w:t>
             </w:r>
           </w:p>
@@ -5514,7 +5678,6 @@
           </w:p>
           <w:p>
             <w:r>
-              <w:lastRenderedPageBreak/>
               <w:t xml:space="preserve">    user = </w:t>
             </w:r>
             <w:proofErr w:type="spellStart"/>
@@ -5566,7 +5729,6 @@
           </w:tcPr>
           <w:p>
             <w:r>
-              <w:lastRenderedPageBreak/>
               <w:t xml:space="preserve">Direct implementation. </w:t>
             </w:r>
             <w:proofErr w:type="gramStart"/>

</xml_diff>